<commit_message>
Publish balanced report with public GitHub repository link
</commit_message>
<xml_diff>
--- a/docs/CmdPrelude_TOC_Project_Report.docx
+++ b/docs/CmdPrelude_TOC_Project_Report.docx
@@ -49,6 +49,32 @@
     </w:p>
     <w:p>
       <w:pPr>
+        <w:spacing w:before="160" w:after="160"/>
+        <w:jc w:val="center"/>
+      </w:pPr>
+      <w:r>
+        <w:rPr>
+          <w:b/>
+        </w:rPr>
+        <w:t>GitHub repository</w:t>
+      </w:r>
+      <w:r>
+        <w:rPr>
+          <w:b/>
+        </w:rPr>
+        <w:br/>
+      </w:r>
+      <w:hyperlink r:id="rId8">
+        <w:r>
+          <w:rPr>
+            <w:u w:val="single"/>
+          </w:rPr>
+          <w:t>https://github.com/aakashsi75/TOC-Project</w:t>
+        </w:r>
+      </w:hyperlink>
+    </w:p>
+    <w:p>
+      <w:pPr>
         <w:keepNext/>
         <w:keepLines/>
         <w:spacing w:after="160"/>
@@ -92,7 +118,6 @@
       <w:pPr>
         <w:keepNext/>
         <w:keepLines/>
-        <w:spacing w:after="80"/>
         <w:jc w:val="center"/>
       </w:pPr>
       <w:r>
@@ -114,7 +139,6 @@
       <w:pPr>
         <w:keepNext/>
         <w:keepLines/>
-        <w:spacing w:after="80"/>
         <w:jc w:val="center"/>
       </w:pPr>
       <w:r>
@@ -136,11 +160,1141 @@
       <w:pPr>
         <w:pStyle w:val="ReportTopic"/>
         <w:pageBreakBefore/>
-      </w:pPr>
+        <w:spacing w:before="0" w:after="240"/>
+      </w:pPr>
+      <w:r>
+        <w:lastRenderedPageBreak/>
+        <w:t>Index</w:t>
+      </w:r>
+    </w:p>
+    <w:p>
+      <w:pPr>
+        <w:tabs>
+          <w:tab w:val="right" w:leader="dot" w:pos="9720"/>
+        </w:tabs>
+        <w:spacing w:after="60"/>
+      </w:pPr>
+      <w:r>
+        <w:rPr>
+          <w:b/>
+          <w:sz w:val="24"/>
+        </w:rPr>
+        <w:t>Aim of the project</w:t>
+      </w:r>
+      <w:r>
+        <w:tab/>
+      </w:r>
+      <w:r>
+        <w:fldChar w:fldCharType="begin"/>
+      </w:r>
+      <w:r>
+        <w:instrText xml:space="preserve"> PAGEREF cmdprelude_topic_1 \h </w:instrText>
+      </w:r>
+      <w:r>
+        <w:fldChar w:fldCharType="separate"/>
+      </w:r>
+      <w:r>
+        <w:rPr>
+          <w:noProof/>
+        </w:rPr>
+        <w:t>3</w:t>
+      </w:r>
+      <w:r>
+        <w:fldChar w:fldCharType="end"/>
+      </w:r>
+    </w:p>
+    <w:p>
+      <w:pPr>
+        <w:tabs>
+          <w:tab w:val="right" w:leader="dot" w:pos="9720"/>
+        </w:tabs>
+        <w:spacing w:after="60"/>
+      </w:pPr>
+      <w:r>
+        <w:rPr>
+          <w:b/>
+          <w:sz w:val="24"/>
+        </w:rPr>
+        <w:t>Abstract</w:t>
+      </w:r>
+      <w:r>
+        <w:tab/>
+      </w:r>
+      <w:r>
+        <w:fldChar w:fldCharType="begin"/>
+      </w:r>
+      <w:r>
+        <w:instrText xml:space="preserve"> PAGEREF cmdprelude_topic_2 \h </w:instrText>
+      </w:r>
+      <w:r>
+        <w:fldChar w:fldCharType="separate"/>
+      </w:r>
+      <w:r>
+        <w:rPr>
+          <w:noProof/>
+        </w:rPr>
+        <w:t>3</w:t>
+      </w:r>
+      <w:r>
+        <w:fldChar w:fldCharType="end"/>
+      </w:r>
+    </w:p>
+    <w:p>
+      <w:pPr>
+        <w:tabs>
+          <w:tab w:val="right" w:leader="dot" w:pos="9720"/>
+        </w:tabs>
+        <w:spacing w:after="60"/>
+      </w:pPr>
+      <w:r>
+        <w:rPr>
+          <w:b/>
+          <w:sz w:val="24"/>
+        </w:rPr>
+        <w:t>Tools used</w:t>
+      </w:r>
+      <w:r>
+        <w:tab/>
+      </w:r>
+      <w:r>
+        <w:fldChar w:fldCharType="begin"/>
+      </w:r>
+      <w:r>
+        <w:instrText xml:space="preserve"> PAGEREF cmdprelude_topic_3 \h </w:instrText>
+      </w:r>
+      <w:r>
+        <w:fldChar w:fldCharType="separate"/>
+      </w:r>
+      <w:r>
+        <w:rPr>
+          <w:noProof/>
+        </w:rPr>
+        <w:t>4</w:t>
+      </w:r>
+      <w:r>
+        <w:fldChar w:fldCharType="end"/>
+      </w:r>
+    </w:p>
+    <w:p>
+      <w:pPr>
+        <w:tabs>
+          <w:tab w:val="right" w:leader="dot" w:pos="9720"/>
+        </w:tabs>
+        <w:spacing w:after="60"/>
+      </w:pPr>
+      <w:r>
+        <w:rPr>
+          <w:b/>
+          <w:sz w:val="24"/>
+        </w:rPr>
+        <w:t>Highlights or features of the project</w:t>
+      </w:r>
+      <w:r>
+        <w:tab/>
+      </w:r>
+      <w:r>
+        <w:fldChar w:fldCharType="begin"/>
+      </w:r>
+      <w:r>
+        <w:instrText xml:space="preserve"> PAGEREF cmdprelude_topic_4 \h </w:instrText>
+      </w:r>
+      <w:r>
+        <w:fldChar w:fldCharType="separate"/>
+      </w:r>
+      <w:r>
+        <w:rPr>
+          <w:noProof/>
+        </w:rPr>
+        <w:t>4</w:t>
+      </w:r>
+      <w:r>
+        <w:fldChar w:fldCharType="end"/>
+      </w:r>
+    </w:p>
+    <w:p>
+      <w:pPr>
+        <w:tabs>
+          <w:tab w:val="right" w:leader="dot" w:pos="9720"/>
+        </w:tabs>
+        <w:spacing w:after="60"/>
+      </w:pPr>
+      <w:r>
+        <w:rPr>
+          <w:b/>
+          <w:sz w:val="24"/>
+        </w:rPr>
+        <w:t>Project Modules</w:t>
+      </w:r>
+      <w:r>
+        <w:tab/>
+      </w:r>
+      <w:r>
+        <w:fldChar w:fldCharType="begin"/>
+      </w:r>
+      <w:r>
+        <w:instrText xml:space="preserve"> PAGEREF cmdprelude_topic_5 \h </w:instrText>
+      </w:r>
+      <w:r>
+        <w:fldChar w:fldCharType="separate"/>
+      </w:r>
+      <w:r>
+        <w:rPr>
+          <w:noProof/>
+        </w:rPr>
+        <w:t>5</w:t>
+      </w:r>
+      <w:r>
+        <w:fldChar w:fldCharType="end"/>
+      </w:r>
+    </w:p>
+    <w:p>
+      <w:pPr>
+        <w:tabs>
+          <w:tab w:val="right" w:leader="dot" w:pos="9720"/>
+        </w:tabs>
+        <w:spacing w:after="60"/>
+      </w:pPr>
+      <w:r>
+        <w:rPr>
+          <w:b/>
+          <w:sz w:val="24"/>
+        </w:rPr>
+        <w:t>Project Architecture</w:t>
+      </w:r>
+      <w:r>
+        <w:tab/>
+      </w:r>
+      <w:r>
+        <w:fldChar w:fldCharType="begin"/>
+      </w:r>
+      <w:r>
+        <w:instrText xml:space="preserve"> PAGEREF cmdprelude_topic_6 \h </w:instrText>
+      </w:r>
+      <w:r>
+        <w:fldChar w:fldCharType="separate"/>
+      </w:r>
+      <w:r>
+        <w:rPr>
+          <w:noProof/>
+        </w:rPr>
+        <w:t>5</w:t>
+      </w:r>
+      <w:r>
+        <w:fldChar w:fldCharType="end"/>
+      </w:r>
+    </w:p>
+    <w:p>
+      <w:pPr>
+        <w:tabs>
+          <w:tab w:val="right" w:leader="dot" w:pos="9720"/>
+        </w:tabs>
+        <w:spacing w:after="60"/>
+      </w:pPr>
+      <w:r>
+        <w:rPr>
+          <w:b/>
+          <w:sz w:val="24"/>
+        </w:rPr>
+        <w:t>Module Description</w:t>
+      </w:r>
+      <w:r>
+        <w:tab/>
+      </w:r>
+      <w:r>
+        <w:fldChar w:fldCharType="begin"/>
+      </w:r>
+      <w:r>
+        <w:instrText xml:space="preserve"> PAGEREF cmdprelude_topic_7 \h </w:instrText>
+      </w:r>
+      <w:r>
+        <w:fldChar w:fldCharType="separate"/>
+      </w:r>
+      <w:r>
+        <w:rPr>
+          <w:noProof/>
+        </w:rPr>
+        <w:t>6</w:t>
+      </w:r>
+      <w:r>
+        <w:fldChar w:fldCharType="end"/>
+      </w:r>
+    </w:p>
+    <w:p>
+      <w:pPr>
+        <w:tabs>
+          <w:tab w:val="right" w:leader="dot" w:pos="9720"/>
+        </w:tabs>
+        <w:spacing w:after="40"/>
+        <w:ind w:left="288"/>
+      </w:pPr>
+      <w:r>
+        <w:rPr>
+          <w:sz w:val="24"/>
+        </w:rPr>
+        <w:t>Command input and tokenization</w:t>
+      </w:r>
+      <w:r>
+        <w:tab/>
+      </w:r>
+      <w:r>
+        <w:fldChar w:fldCharType="begin"/>
+      </w:r>
+      <w:r>
+        <w:instrText xml:space="preserve"> PAGEREF cmdprelude_topic_8 \h </w:instrText>
+      </w:r>
+      <w:r>
+        <w:fldChar w:fldCharType="separate"/>
+      </w:r>
+      <w:r>
+        <w:rPr>
+          <w:noProof/>
+        </w:rPr>
+        <w:t>6</w:t>
+      </w:r>
+      <w:r>
+        <w:fldChar w:fldCharType="end"/>
+      </w:r>
+    </w:p>
+    <w:p>
+      <w:pPr>
+        <w:tabs>
+          <w:tab w:val="right" w:leader="dot" w:pos="9720"/>
+        </w:tabs>
+        <w:spacing w:after="40"/>
+        <w:ind w:left="288"/>
+      </w:pPr>
+      <w:r>
+        <w:rPr>
+          <w:sz w:val="24"/>
+        </w:rPr>
+        <w:t>Grammar definition and validation</w:t>
+      </w:r>
+      <w:r>
+        <w:tab/>
+      </w:r>
+      <w:r>
+        <w:fldChar w:fldCharType="begin"/>
+      </w:r>
+      <w:r>
+        <w:instrText xml:space="preserve"> PAGEREF cmdprelude_topic_9 \h </w:instrText>
+      </w:r>
+      <w:r>
+        <w:fldChar w:fldCharType="separate"/>
+      </w:r>
+      <w:r>
+        <w:rPr>
+          <w:noProof/>
+        </w:rPr>
+        <w:t>6</w:t>
+      </w:r>
+      <w:r>
+        <w:fldChar w:fldCharType="end"/>
+      </w:r>
+    </w:p>
+    <w:p>
+      <w:pPr>
+        <w:tabs>
+          <w:tab w:val="right" w:leader="dot" w:pos="9720"/>
+        </w:tabs>
+        <w:spacing w:after="40"/>
+        <w:ind w:left="288"/>
+      </w:pPr>
+      <w:r>
+        <w:rPr>
+          <w:sz w:val="24"/>
+        </w:rPr>
+        <w:t>Grammar simplification and CNF conversion</w:t>
+      </w:r>
+      <w:r>
+        <w:tab/>
+      </w:r>
+      <w:r>
+        <w:fldChar w:fldCharType="begin"/>
+      </w:r>
+      <w:r>
+        <w:instrText xml:space="preserve"> PAGEREF cmdprelude_topic_10 \h </w:instrText>
+      </w:r>
+      <w:r>
+        <w:fldChar w:fldCharType="separate"/>
+      </w:r>
+      <w:r>
+        <w:rPr>
+          <w:noProof/>
+        </w:rPr>
+        <w:t>6</w:t>
+      </w:r>
+      <w:r>
+        <w:fldChar w:fldCharType="end"/>
+      </w:r>
+    </w:p>
+    <w:p>
+      <w:pPr>
+        <w:tabs>
+          <w:tab w:val="right" w:leader="dot" w:pos="9720"/>
+        </w:tabs>
+        <w:spacing w:after="40"/>
+        <w:ind w:left="288"/>
+      </w:pPr>
+      <w:r>
+        <w:rPr>
+          <w:sz w:val="24"/>
+        </w:rPr>
+        <w:t>CYK parsing and tree reconstruction</w:t>
+      </w:r>
+      <w:r>
+        <w:tab/>
+      </w:r>
+      <w:r>
+        <w:fldChar w:fldCharType="begin"/>
+      </w:r>
+      <w:r>
+        <w:instrText xml:space="preserve"> PAGEREF cmdprelude_topic_11 \h </w:instrText>
+      </w:r>
+      <w:r>
+        <w:fldChar w:fldCharType="separate"/>
+      </w:r>
+      <w:r>
+        <w:rPr>
+          <w:noProof/>
+        </w:rPr>
+        <w:t>7</w:t>
+      </w:r>
+      <w:r>
+        <w:fldChar w:fldCharType="end"/>
+      </w:r>
+    </w:p>
+    <w:p>
+      <w:pPr>
+        <w:tabs>
+          <w:tab w:val="right" w:leader="dot" w:pos="9720"/>
+        </w:tabs>
+        <w:spacing w:after="40"/>
+        <w:ind w:left="288"/>
+      </w:pPr>
+      <w:r>
+        <w:rPr>
+          <w:sz w:val="24"/>
+        </w:rPr>
+        <w:t>Command interpretation and file change simulation</w:t>
+      </w:r>
+      <w:r>
+        <w:tab/>
+      </w:r>
+      <w:r>
+        <w:fldChar w:fldCharType="begin"/>
+      </w:r>
+      <w:r>
+        <w:instrText xml:space="preserve"> PAGEREF cmdprelude_topic_12 \h </w:instrText>
+      </w:r>
+      <w:r>
+        <w:fldChar w:fldCharType="separate"/>
+      </w:r>
+      <w:r>
+        <w:rPr>
+          <w:noProof/>
+        </w:rPr>
+        <w:t>7</w:t>
+      </w:r>
+      <w:r>
+        <w:fldChar w:fldCharType="end"/>
+      </w:r>
+    </w:p>
+    <w:p>
+      <w:pPr>
+        <w:tabs>
+          <w:tab w:val="right" w:leader="dot" w:pos="9720"/>
+        </w:tabs>
+        <w:spacing w:after="40"/>
+        <w:ind w:left="288"/>
+      </w:pPr>
+      <w:r>
+        <w:rPr>
+          <w:sz w:val="24"/>
+        </w:rPr>
+        <w:t>Error detection and recovery</w:t>
+      </w:r>
+      <w:r>
+        <w:tab/>
+      </w:r>
+      <w:r>
+        <w:fldChar w:fldCharType="begin"/>
+      </w:r>
+      <w:r>
+        <w:instrText xml:space="preserve"> PAGEREF cmdprelude_topic_13 \h </w:instrText>
+      </w:r>
+      <w:r>
+        <w:fldChar w:fldCharType="separate"/>
+      </w:r>
+      <w:r>
+        <w:rPr>
+          <w:noProof/>
+        </w:rPr>
+        <w:t>7</w:t>
+      </w:r>
+      <w:r>
+        <w:fldChar w:fldCharType="end"/>
+      </w:r>
+    </w:p>
+    <w:p>
+      <w:pPr>
+        <w:tabs>
+          <w:tab w:val="right" w:leader="dot" w:pos="9720"/>
+        </w:tabs>
+        <w:spacing w:after="40"/>
+        <w:ind w:left="288"/>
+      </w:pPr>
+      <w:r>
+        <w:rPr>
+          <w:sz w:val="24"/>
+        </w:rPr>
+        <w:t>Workspace import and reviewed local file operations</w:t>
+      </w:r>
+      <w:r>
+        <w:tab/>
+      </w:r>
+      <w:r>
+        <w:fldChar w:fldCharType="begin"/>
+      </w:r>
+      <w:r>
+        <w:instrText xml:space="preserve"> PAGEREF cmdprelude_topic_14 \h </w:instrText>
+      </w:r>
+      <w:r>
+        <w:fldChar w:fldCharType="separate"/>
+      </w:r>
+      <w:r>
+        <w:rPr>
+          <w:noProof/>
+        </w:rPr>
+        <w:t>8</w:t>
+      </w:r>
+      <w:r>
+        <w:fldChar w:fldCharType="end"/>
+      </w:r>
+    </w:p>
+    <w:p>
+      <w:pPr>
+        <w:tabs>
+          <w:tab w:val="right" w:leader="dot" w:pos="9720"/>
+        </w:tabs>
+        <w:spacing w:after="40"/>
+        <w:ind w:left="288"/>
+      </w:pPr>
+      <w:r>
+        <w:rPr>
+          <w:sz w:val="24"/>
+        </w:rPr>
+        <w:t>Interface and API integration</w:t>
+      </w:r>
+      <w:r>
+        <w:tab/>
+      </w:r>
+      <w:r>
+        <w:fldChar w:fldCharType="begin"/>
+      </w:r>
+      <w:r>
+        <w:instrText xml:space="preserve"> PAGEREF cmdprelude_topic_15 \h </w:instrText>
+      </w:r>
+      <w:r>
+        <w:fldChar w:fldCharType="separate"/>
+      </w:r>
+      <w:r>
+        <w:rPr>
+          <w:noProof/>
+        </w:rPr>
+        <w:t>8</w:t>
+      </w:r>
+      <w:r>
+        <w:fldChar w:fldCharType="end"/>
+      </w:r>
+    </w:p>
+    <w:p>
+      <w:pPr>
+        <w:tabs>
+          <w:tab w:val="right" w:leader="dot" w:pos="9720"/>
+        </w:tabs>
+        <w:spacing w:after="60"/>
+      </w:pPr>
+      <w:r>
+        <w:rPr>
+          <w:b/>
+          <w:sz w:val="24"/>
+        </w:rPr>
+        <w:t>Role of Team members</w:t>
+      </w:r>
+      <w:r>
+        <w:tab/>
+      </w:r>
+      <w:r>
+        <w:fldChar w:fldCharType="begin"/>
+      </w:r>
+      <w:r>
+        <w:instrText xml:space="preserve"> PAGEREF cmdprelude_topic_16 \h </w:instrText>
+      </w:r>
+      <w:r>
+        <w:fldChar w:fldCharType="separate"/>
+      </w:r>
+      <w:r>
+        <w:rPr>
+          <w:noProof/>
+        </w:rPr>
+        <w:t>8</w:t>
+      </w:r>
+      <w:r>
+        <w:fldChar w:fldCharType="end"/>
+      </w:r>
+    </w:p>
+    <w:p>
+      <w:pPr>
+        <w:tabs>
+          <w:tab w:val="right" w:leader="dot" w:pos="9720"/>
+        </w:tabs>
+        <w:spacing w:after="60"/>
+      </w:pPr>
+      <w:r>
+        <w:rPr>
+          <w:b/>
+          <w:sz w:val="24"/>
+        </w:rPr>
+        <w:t>Software description</w:t>
+      </w:r>
+      <w:r>
+        <w:tab/>
+      </w:r>
+      <w:r>
+        <w:fldChar w:fldCharType="begin"/>
+      </w:r>
+      <w:r>
+        <w:instrText xml:space="preserve"> PAGEREF cmdprelude_topic_17 \h </w:instrText>
+      </w:r>
+      <w:r>
+        <w:fldChar w:fldCharType="separate"/>
+      </w:r>
+      <w:r>
+        <w:rPr>
+          <w:noProof/>
+        </w:rPr>
+        <w:t>9</w:t>
+      </w:r>
+      <w:r>
+        <w:fldChar w:fldCharType="end"/>
+      </w:r>
+    </w:p>
+    <w:p>
+      <w:pPr>
+        <w:tabs>
+          <w:tab w:val="right" w:leader="dot" w:pos="9720"/>
+        </w:tabs>
+        <w:spacing w:after="60"/>
+      </w:pPr>
+      <w:r>
+        <w:rPr>
+          <w:b/>
+          <w:sz w:val="24"/>
+        </w:rPr>
+        <w:t>Coding</w:t>
+      </w:r>
+      <w:r>
+        <w:tab/>
+      </w:r>
+      <w:r>
+        <w:fldChar w:fldCharType="begin"/>
+      </w:r>
+      <w:r>
+        <w:instrText xml:space="preserve"> PAGEREF cmdprelude_topic_18 \h </w:instrText>
+      </w:r>
+      <w:r>
+        <w:fldChar w:fldCharType="separate"/>
+      </w:r>
+      <w:r>
+        <w:rPr>
+          <w:noProof/>
+        </w:rPr>
+        <w:t>9</w:t>
+      </w:r>
+      <w:r>
+        <w:fldChar w:fldCharType="end"/>
+      </w:r>
+    </w:p>
+    <w:p>
+      <w:pPr>
+        <w:tabs>
+          <w:tab w:val="right" w:leader="dot" w:pos="9720"/>
+        </w:tabs>
+        <w:spacing w:after="40"/>
+        <w:ind w:left="288"/>
+      </w:pPr>
+      <w:r>
+        <w:rPr>
+          <w:sz w:val="24"/>
+        </w:rPr>
+        <w:t>Basic command grammar</w:t>
+      </w:r>
+      <w:r>
+        <w:tab/>
+      </w:r>
+      <w:r>
+        <w:fldChar w:fldCharType="begin"/>
+      </w:r>
+      <w:r>
+        <w:instrText xml:space="preserve"> PAGEREF cmdprelude_topic_19 \h </w:instrText>
+      </w:r>
+      <w:r>
+        <w:fldChar w:fldCharType="separate"/>
+      </w:r>
+      <w:r>
+        <w:rPr>
+          <w:noProof/>
+        </w:rPr>
+        <w:t>9</w:t>
+      </w:r>
+      <w:r>
+        <w:fldChar w:fldCharType="end"/>
+      </w:r>
+    </w:p>
+    <w:p>
+      <w:pPr>
+        <w:tabs>
+          <w:tab w:val="right" w:leader="dot" w:pos="9720"/>
+        </w:tabs>
+        <w:spacing w:after="40"/>
+        <w:ind w:left="288"/>
+      </w:pPr>
+      <w:r>
+        <w:rPr>
+          <w:sz w:val="24"/>
+        </w:rPr>
+        <w:t>Grammar compilation</w:t>
+      </w:r>
+      <w:r>
+        <w:tab/>
+      </w:r>
+      <w:r>
+        <w:fldChar w:fldCharType="begin"/>
+      </w:r>
+      <w:r>
+        <w:instrText xml:space="preserve"> PAGEREF cmdprelude_topic_20 \h </w:instrText>
+      </w:r>
+      <w:r>
+        <w:fldChar w:fldCharType="separate"/>
+      </w:r>
+      <w:r>
+        <w:rPr>
+          <w:noProof/>
+        </w:rPr>
+        <w:t>9</w:t>
+      </w:r>
+      <w:r>
+        <w:fldChar w:fldCharType="end"/>
+      </w:r>
+    </w:p>
+    <w:p>
+      <w:pPr>
+        <w:tabs>
+          <w:tab w:val="right" w:leader="dot" w:pos="9720"/>
+        </w:tabs>
+        <w:spacing w:after="40"/>
+        <w:ind w:left="288"/>
+      </w:pPr>
+      <w:r>
+        <w:rPr>
+          <w:sz w:val="24"/>
+        </w:rPr>
+        <w:t>CYK recognition and tree reconstruction</w:t>
+      </w:r>
+      <w:r>
+        <w:tab/>
+      </w:r>
+      <w:r>
+        <w:fldChar w:fldCharType="begin"/>
+      </w:r>
+      <w:r>
+        <w:instrText xml:space="preserve"> PAGEREF cmdprelude_topic_21 \h </w:instrText>
+      </w:r>
+      <w:r>
+        <w:fldChar w:fldCharType="separate"/>
+      </w:r>
+      <w:r>
+        <w:rPr>
+          <w:noProof/>
+        </w:rPr>
+        <w:t>10</w:t>
+      </w:r>
+      <w:r>
+        <w:fldChar w:fldCharType="end"/>
+      </w:r>
+    </w:p>
+    <w:p>
+      <w:pPr>
+        <w:tabs>
+          <w:tab w:val="right" w:leader="dot" w:pos="9720"/>
+        </w:tabs>
+        <w:spacing w:after="40"/>
+        <w:ind w:left="288"/>
+      </w:pPr>
+      <w:r>
+        <w:rPr>
+          <w:sz w:val="24"/>
+        </w:rPr>
+        <w:t>Nested command groups</w:t>
+      </w:r>
+      <w:r>
+        <w:tab/>
+      </w:r>
+      <w:r>
+        <w:fldChar w:fldCharType="begin"/>
+      </w:r>
+      <w:r>
+        <w:instrText xml:space="preserve"> PAGEREF cmdprelude_topic_22 \h </w:instrText>
+      </w:r>
+      <w:r>
+        <w:fldChar w:fldCharType="separate"/>
+      </w:r>
+      <w:r>
+        <w:rPr>
+          <w:noProof/>
+        </w:rPr>
+        <w:t>10</w:t>
+      </w:r>
+      <w:r>
+        <w:fldChar w:fldCharType="end"/>
+      </w:r>
+    </w:p>
+    <w:p>
+      <w:pPr>
+        <w:tabs>
+          <w:tab w:val="right" w:leader="dot" w:pos="9720"/>
+        </w:tabs>
+        <w:spacing w:after="40"/>
+        <w:ind w:left="288"/>
+      </w:pPr>
+      <w:r>
+        <w:rPr>
+          <w:sz w:val="24"/>
+        </w:rPr>
+        <w:t>Error recovery and reparsing</w:t>
+      </w:r>
+      <w:r>
+        <w:tab/>
+      </w:r>
+      <w:r>
+        <w:fldChar w:fldCharType="begin"/>
+      </w:r>
+      <w:r>
+        <w:instrText xml:space="preserve"> PAGEREF cmdprelude_topic_23 \h </w:instrText>
+      </w:r>
+      <w:r>
+        <w:fldChar w:fldCharType="separate"/>
+      </w:r>
+      <w:r>
+        <w:rPr>
+          <w:noProof/>
+        </w:rPr>
+        <w:t>10</w:t>
+      </w:r>
+      <w:r>
+        <w:fldChar w:fldCharType="end"/>
+      </w:r>
+    </w:p>
+    <w:p>
+      <w:pPr>
+        <w:tabs>
+          <w:tab w:val="right" w:leader="dot" w:pos="9720"/>
+        </w:tabs>
+        <w:spacing w:after="40"/>
+        <w:ind w:left="288"/>
+      </w:pPr>
+      <w:r>
+        <w:rPr>
+          <w:sz w:val="24"/>
+        </w:rPr>
+        <w:t>Workspace snapshot and change detection</w:t>
+      </w:r>
+      <w:r>
+        <w:tab/>
+      </w:r>
+      <w:r>
+        <w:fldChar w:fldCharType="begin"/>
+      </w:r>
+      <w:r>
+        <w:instrText xml:space="preserve"> PAGEREF cmdprelude_snapshot \h </w:instrText>
+      </w:r>
+      <w:r>
+        <w:fldChar w:fldCharType="separate"/>
+      </w:r>
+      <w:r>
+        <w:rPr>
+          <w:noProof/>
+        </w:rPr>
+        <w:t>10</w:t>
+      </w:r>
+      <w:r>
+        <w:fldChar w:fldCharType="end"/>
+      </w:r>
+    </w:p>
+    <w:p>
+      <w:pPr>
+        <w:tabs>
+          <w:tab w:val="right" w:leader="dot" w:pos="9720"/>
+        </w:tabs>
+        <w:spacing w:after="40"/>
+        <w:ind w:left="288"/>
+      </w:pPr>
+      <w:r>
+        <w:rPr>
+          <w:sz w:val="24"/>
+        </w:rPr>
+        <w:t>Simulation API</w:t>
+      </w:r>
+      <w:r>
+        <w:tab/>
+      </w:r>
+      <w:r>
+        <w:fldChar w:fldCharType="begin"/>
+      </w:r>
+      <w:r>
+        <w:instrText xml:space="preserve"> PAGEREF cmdprelude_topic_24 \h </w:instrText>
+      </w:r>
+      <w:r>
+        <w:fldChar w:fldCharType="separate"/>
+      </w:r>
+      <w:r>
+        <w:rPr>
+          <w:noProof/>
+        </w:rPr>
+        <w:t>11</w:t>
+      </w:r>
+      <w:r>
+        <w:fldChar w:fldCharType="end"/>
+      </w:r>
+    </w:p>
+    <w:p>
+      <w:pPr>
+        <w:tabs>
+          <w:tab w:val="right" w:leader="dot" w:pos="9720"/>
+        </w:tabs>
+        <w:spacing w:after="40"/>
+        <w:ind w:left="288"/>
+      </w:pPr>
+      <w:r>
+        <w:rPr>
+          <w:sz w:val="24"/>
+        </w:rPr>
+        <w:t>Testing and demonstration cases</w:t>
+      </w:r>
+      <w:r>
+        <w:tab/>
+      </w:r>
+      <w:r>
+        <w:fldChar w:fldCharType="begin"/>
+      </w:r>
+      <w:r>
+        <w:instrText xml:space="preserve"> PAGEREF cmdprelude_topic_25 \h </w:instrText>
+      </w:r>
+      <w:r>
+        <w:fldChar w:fldCharType="separate"/>
+      </w:r>
+      <w:r>
+        <w:rPr>
+          <w:noProof/>
+        </w:rPr>
+        <w:t>11</w:t>
+      </w:r>
+      <w:r>
+        <w:fldChar w:fldCharType="end"/>
+      </w:r>
+    </w:p>
+    <w:p>
+      <w:pPr>
+        <w:tabs>
+          <w:tab w:val="right" w:leader="dot" w:pos="9720"/>
+        </w:tabs>
+        <w:spacing w:after="60"/>
+      </w:pPr>
+      <w:r>
+        <w:rPr>
+          <w:b/>
+          <w:sz w:val="24"/>
+        </w:rPr>
+        <w:t>Screenshot of the errors segments</w:t>
+      </w:r>
+      <w:r>
+        <w:tab/>
+      </w:r>
+      <w:r>
+        <w:fldChar w:fldCharType="begin"/>
+      </w:r>
+      <w:r>
+        <w:instrText xml:space="preserve"> PAGEREF cmdprelude_topic_26 \h </w:instrText>
+      </w:r>
+      <w:r>
+        <w:fldChar w:fldCharType="separate"/>
+      </w:r>
+      <w:r>
+        <w:rPr>
+          <w:noProof/>
+        </w:rPr>
+        <w:t>12</w:t>
+      </w:r>
+      <w:r>
+        <w:fldChar w:fldCharType="end"/>
+      </w:r>
+    </w:p>
+    <w:p>
+      <w:pPr>
+        <w:tabs>
+          <w:tab w:val="right" w:leader="dot" w:pos="9720"/>
+        </w:tabs>
+        <w:spacing w:after="60"/>
+      </w:pPr>
+      <w:r>
+        <w:rPr>
+          <w:b/>
+          <w:sz w:val="24"/>
+        </w:rPr>
+        <w:t>Screenshot of the error recovered segments</w:t>
+      </w:r>
+      <w:r>
+        <w:tab/>
+      </w:r>
+      <w:r>
+        <w:fldChar w:fldCharType="begin"/>
+      </w:r>
+      <w:r>
+        <w:instrText xml:space="preserve"> PAGEREF cmdprelude_topic_27 \h </w:instrText>
+      </w:r>
+      <w:r>
+        <w:fldChar w:fldCharType="separate"/>
+      </w:r>
+      <w:r>
+        <w:rPr>
+          <w:noProof/>
+        </w:rPr>
+        <w:t>13</w:t>
+      </w:r>
+      <w:r>
+        <w:fldChar w:fldCharType="end"/>
+      </w:r>
+    </w:p>
+    <w:p>
+      <w:pPr>
+        <w:tabs>
+          <w:tab w:val="right" w:leader="dot" w:pos="9720"/>
+        </w:tabs>
+        <w:spacing w:after="60"/>
+      </w:pPr>
+      <w:r>
+        <w:rPr>
+          <w:b/>
+          <w:sz w:val="24"/>
+        </w:rPr>
+        <w:t>Possible future work</w:t>
+      </w:r>
+      <w:r>
+        <w:tab/>
+      </w:r>
+      <w:r>
+        <w:fldChar w:fldCharType="begin"/>
+      </w:r>
+      <w:r>
+        <w:instrText xml:space="preserve"> PAGEREF cmdprelude_topic_28 \h </w:instrText>
+      </w:r>
+      <w:r>
+        <w:fldChar w:fldCharType="separate"/>
+      </w:r>
+      <w:r>
+        <w:rPr>
+          <w:noProof/>
+        </w:rPr>
+        <w:t>14</w:t>
+      </w:r>
+      <w:r>
+        <w:fldChar w:fldCharType="end"/>
+      </w:r>
+    </w:p>
+    <w:p>
+      <w:pPr>
+        <w:tabs>
+          <w:tab w:val="right" w:leader="dot" w:pos="9720"/>
+        </w:tabs>
+        <w:spacing w:after="60"/>
+      </w:pPr>
+      <w:r>
+        <w:rPr>
+          <w:b/>
+          <w:sz w:val="24"/>
+        </w:rPr>
+        <w:t>Conclusion</w:t>
+      </w:r>
+      <w:r>
+        <w:tab/>
+      </w:r>
+      <w:r>
+        <w:fldChar w:fldCharType="begin"/>
+      </w:r>
+      <w:r>
+        <w:instrText xml:space="preserve"> PAGEREF cmdprelude_topic_29 \h </w:instrText>
+      </w:r>
+      <w:r>
+        <w:fldChar w:fldCharType="separate"/>
+      </w:r>
+      <w:r>
+        <w:rPr>
+          <w:noProof/>
+        </w:rPr>
+        <w:t>14</w:t>
+      </w:r>
+      <w:r>
+        <w:fldChar w:fldCharType="end"/>
+      </w:r>
+    </w:p>
+    <w:p>
+      <w:pPr>
+        <w:tabs>
+          <w:tab w:val="right" w:leader="dot" w:pos="9720"/>
+        </w:tabs>
+        <w:spacing w:after="60"/>
+      </w:pPr>
+      <w:r>
+        <w:rPr>
+          <w:b/>
+          <w:sz w:val="24"/>
+        </w:rPr>
+        <w:t>References</w:t>
+      </w:r>
+      <w:r>
+        <w:tab/>
+      </w:r>
+      <w:r>
+        <w:fldChar w:fldCharType="begin"/>
+      </w:r>
+      <w:r>
+        <w:instrText xml:space="preserve"> PAGEREF cmdprelude_topic_30 \h </w:instrText>
+      </w:r>
+      <w:r>
+        <w:fldChar w:fldCharType="separate"/>
+      </w:r>
+      <w:r>
+        <w:rPr>
+          <w:noProof/>
+        </w:rPr>
+        <w:t>15</w:t>
+      </w:r>
+      <w:r>
+        <w:fldChar w:fldCharType="end"/>
+      </w:r>
+    </w:p>
+    <w:p>
+      <w:pPr>
+        <w:pStyle w:val="ReportTopic"/>
+        <w:keepLines/>
+        <w:pageBreakBefore/>
+      </w:pPr>
+      <w:bookmarkStart w:id="0" w:name="cmdprelude_topic_1"/>
       <w:r>
         <w:lastRenderedPageBreak/>
         <w:t>Aim of the project</w:t>
       </w:r>
+      <w:bookmarkEnd w:id="0"/>
     </w:p>
     <w:p>
       <w:pPr>
@@ -154,49 +1308,7 @@
         <w:rPr>
           <w:lang w:val="en-IN"/>
         </w:rPr>
-        <w:t xml:space="preserve">The aim of this project is to develop </w:t>
-      </w:r>
-      <w:proofErr w:type="spellStart"/>
-      <w:r>
-        <w:rPr>
-          <w:lang w:val="en-IN"/>
-        </w:rPr>
-        <w:t>CmdPrelude</w:t>
-      </w:r>
-      <w:proofErr w:type="spellEnd"/>
-      <w:r>
-        <w:rPr>
-          <w:lang w:val="en-IN"/>
-        </w:rPr>
-        <w:t xml:space="preserve">, a tool that helps users understand supported shell commands and preview their effects on files and folders before applying changes. It uses a context-free grammar to describe valid command structures and the </w:t>
-      </w:r>
-      <w:proofErr w:type="spellStart"/>
-      <w:r>
-        <w:rPr>
-          <w:lang w:val="en-IN"/>
-        </w:rPr>
-        <w:t>Cocke</w:t>
-      </w:r>
-      <w:proofErr w:type="spellEnd"/>
-      <w:r>
-        <w:rPr>
-          <w:lang w:val="en-IN"/>
-        </w:rPr>
-        <w:t>–Younger–</w:t>
-      </w:r>
-      <w:proofErr w:type="spellStart"/>
-      <w:r>
-        <w:rPr>
-          <w:lang w:val="en-IN"/>
-        </w:rPr>
-        <w:t>Kasami</w:t>
-      </w:r>
-      <w:proofErr w:type="spellEnd"/>
-      <w:r>
-        <w:rPr>
-          <w:lang w:val="en-IN"/>
-        </w:rPr>
-        <w:t xml:space="preserve"> (CYK) algorithm to check whether an entered command follows those rules.</w:t>
+        <w:t>The aim of this project is to develop CmdPrelude, a tool that helps users understand supported shell commands and preview their effects on files and folders before applying changes. It uses a context-free grammar to describe valid command structures and the Cocke–Younger–Kasami (CYK) algorithm to check whether an entered command follows those rules.</w:t>
       </w:r>
     </w:p>
     <w:p>
@@ -217,11 +1329,13 @@
     <w:p>
       <w:pPr>
         <w:pStyle w:val="ReportTopic"/>
+        <w:keepLines/>
         <w:rPr>
           <w:bCs/>
           <w:szCs w:val="32"/>
         </w:rPr>
       </w:pPr>
+      <w:bookmarkStart w:id="1" w:name="cmdprelude_topic_2"/>
       <w:r>
         <w:rPr>
           <w:bCs/>
@@ -229,68 +1343,59 @@
         </w:rPr>
         <w:t>Abstract</w:t>
       </w:r>
-    </w:p>
-    <w:p>
+      <w:bookmarkEnd w:id="1"/>
+    </w:p>
+    <w:p>
+      <w:pPr>
+        <w:keepLines/>
+      </w:pPr>
       <w:r>
         <w:t>Shell commands offer a quick way to manage files and folders, but their effects are not always clear before execution. Beginners may struggle with command arguments, operators and nested groups. Syntax mistakes can cause failures, while a correctly written command may still produce unintended changes. Error messages alone often do not explain how to correct the input or what the command would do. This creates a need for a tool that explains both command structure and its expected effects before changes are made.</w:t>
       </w:r>
     </w:p>
     <w:p>
-      <w:r>
-        <w:t xml:space="preserve">To address this problem, we propose </w:t>
-      </w:r>
-      <w:proofErr w:type="spellStart"/>
-      <w:r>
-        <w:t>CmdPrelude</w:t>
-      </w:r>
-      <w:proofErr w:type="spellEnd"/>
-      <w:r>
-        <w:t xml:space="preserve">, a web application that analyses a supported subset of Bash-style commands and previews their effects on a workspace. The system separates the input into tokens and checks it against a selected context-free grammar. The grammar is simplified and converted into Chomsky Normal Form, after which the </w:t>
-      </w:r>
-      <w:proofErr w:type="spellStart"/>
-      <w:r>
-        <w:t>Cocke</w:t>
-      </w:r>
-      <w:proofErr w:type="spellEnd"/>
-      <w:r>
-        <w:t>–Younger–</w:t>
-      </w:r>
-      <w:proofErr w:type="spellStart"/>
-      <w:r>
-        <w:t>Kasami</w:t>
-      </w:r>
-      <w:proofErr w:type="spellEnd"/>
-      <w:r>
-        <w:t xml:space="preserve"> (CYK) algorithm checks whether the command follows the grammar. A separate interpreter uses the resulting parse tree to check workspace conditions and calculate command output, errors and proposed file changes. This separates syntactic correctness from successful execution: a command may follow the grammar but still fail because a required file does not exist.</w:t>
-      </w:r>
-    </w:p>
-    <w:p>
+      <w:pPr>
+        <w:keepLines/>
+      </w:pPr>
+      <w:r>
+        <w:t>To address this problem, we propose CmdPrelude, a web application that analyses a supported subset of Bash-style commands and previews their effects on a workspace. The system separates the input into tokens and checks it against a selected context-free grammar. The grammar is simplified and converted into Chomsky Normal Form, after which the Cocke–Younger–Kasami (CYK) algorithm checks whether the command follows the grammar. A separate interpreter uses the resulting parse tree to check workspace conditions and calculate command output, errors and proposed file changes. This separates syntactic correctness from successful execution: a command may follow the grammar but still fail because a required file does not exist.</w:t>
+      </w:r>
+    </w:p>
+    <w:p>
+      <w:pPr>
+        <w:keepLines/>
+      </w:pPr>
       <w:r>
         <w:t>The application presents its analysis through grammar transformations, parse trees, step-by-step CYK computation and before-and-after file views. Basic mode supports simple file-management commands, while Advanced mode introduces selected flags, pipelines, conditional chains and nested command groups. Users can also modify grammar rules to observe how they affect command acceptance. For common syntax mistakes, the system suggests corrections and validates each candidate through the same parser.</w:t>
       </w:r>
     </w:p>
     <w:p>
-      <w:r>
-        <w:t xml:space="preserve">Users can experiment with a sample workspace or preview operations on a selected folder. Supported changes to real files require explicit review before application. By combining formal parsing, limited syntax recovery and file-change simulation, </w:t>
-      </w:r>
-      <w:proofErr w:type="spellStart"/>
-      <w:r>
-        <w:t>CmdPrelude</w:t>
-      </w:r>
-      <w:proofErr w:type="spellEnd"/>
-      <w:r>
-        <w:t xml:space="preserve"> connects Theory of Computation concepts with a practical tool for understanding commands and reviewing their consequences.</w:t>
+      <w:pPr>
+        <w:keepLines/>
+      </w:pPr>
+      <w:r>
+        <w:t>Users can experiment with a sample workspace or preview operations on a selected folder. Supported changes to real files require explicit review before application. By combining formal parsing, limited syntax recovery and file-change simulation, CmdPrelude connects Theory of Computation concepts with a practical tool for understanding commands and reviewing their consequences.</w:t>
+      </w:r>
+    </w:p>
+    <w:p>
+      <w:pPr>
+        <w:keepLines/>
+      </w:pPr>
+      <w:r>
+        <w:t>The workflow also separates learning from applying changes. Users can inspect the grammar and proposed result, correct an input, and compare the new analysis before deciding whether to keep a virtual change or review a supported real-folder operation. The preview remains an explanation of the documented command subset; it does not claim to reproduce every behaviour of a complete shell.</w:t>
       </w:r>
     </w:p>
     <w:p>
       <w:pPr>
         <w:pStyle w:val="ReportTopic"/>
-        <w:pageBreakBefore/>
-      </w:pPr>
+        <w:keepLines/>
+      </w:pPr>
+      <w:bookmarkStart w:id="2" w:name="cmdprelude_topic_3"/>
       <w:r>
         <w:lastRenderedPageBreak/>
         <w:t>Tools used</w:t>
       </w:r>
+      <w:bookmarkEnd w:id="2"/>
     </w:p>
     <w:tbl>
       <w:tblPr>
@@ -329,7 +1434,9 @@
           </w:tcPr>
           <w:p>
             <w:pPr>
-              <w:spacing w:after="40" w:line="264" w:lineRule="auto"/>
+              <w:keepNext/>
+              <w:keepLines/>
+              <w:spacing w:after="60"/>
             </w:pPr>
             <w:r>
               <w:rPr>
@@ -359,7 +1466,9 @@
           </w:tcPr>
           <w:p>
             <w:pPr>
-              <w:spacing w:after="40" w:line="264" w:lineRule="auto"/>
+              <w:keepNext/>
+              <w:keepLines/>
+              <w:spacing w:after="60"/>
             </w:pPr>
             <w:r>
               <w:rPr>
@@ -394,7 +1503,9 @@
           </w:tcPr>
           <w:p>
             <w:pPr>
-              <w:spacing w:after="40" w:line="264" w:lineRule="auto"/>
+              <w:keepNext/>
+              <w:keepLines/>
+              <w:spacing w:after="60"/>
             </w:pPr>
             <w:r>
               <w:t>JavaScript</w:t>
@@ -420,7 +1531,9 @@
           </w:tcPr>
           <w:p>
             <w:pPr>
-              <w:spacing w:after="40" w:line="264" w:lineRule="auto"/>
+              <w:keepNext/>
+              <w:keepLines/>
+              <w:spacing w:after="60"/>
             </w:pPr>
             <w:r>
               <w:t>Implements the grammar pipeline, command interpreter and browser behaviour.</w:t>
@@ -452,7 +1565,9 @@
           </w:tcPr>
           <w:p>
             <w:pPr>
-              <w:spacing w:after="40" w:line="264" w:lineRule="auto"/>
+              <w:keepNext/>
+              <w:keepLines/>
+              <w:spacing w:after="60"/>
             </w:pPr>
             <w:r>
               <w:t>Node.js and npm</w:t>
@@ -478,18 +1593,12 @@
           </w:tcPr>
           <w:p>
             <w:pPr>
-              <w:spacing w:after="40" w:line="264" w:lineRule="auto"/>
+              <w:keepNext/>
+              <w:keepLines/>
+              <w:spacing w:after="60"/>
             </w:pPr>
             <w:r>
-              <w:t xml:space="preserve">Node.js runs the backend server, while </w:t>
-            </w:r>
-            <w:proofErr w:type="spellStart"/>
-            <w:r>
-              <w:t>npm</w:t>
-            </w:r>
-            <w:proofErr w:type="spellEnd"/>
-            <w:r>
-              <w:t xml:space="preserve"> manages dependencies and runs project scripts</w:t>
+              <w:t>Node.js runs the backend server, while npm manages dependencies and runs project scripts</w:t>
             </w:r>
           </w:p>
         </w:tc>
@@ -518,7 +1627,9 @@
           </w:tcPr>
           <w:p>
             <w:pPr>
-              <w:spacing w:after="40" w:line="264" w:lineRule="auto"/>
+              <w:keepNext/>
+              <w:keepLines/>
+              <w:spacing w:after="60"/>
             </w:pPr>
             <w:r>
               <w:t>Express 4</w:t>
@@ -544,7 +1655,9 @@
           </w:tcPr>
           <w:p>
             <w:pPr>
-              <w:spacing w:after="40" w:line="264" w:lineRule="auto"/>
+              <w:keepNext/>
+              <w:keepLines/>
+              <w:spacing w:after="60"/>
             </w:pPr>
             <w:r>
               <w:t>Provides HTTP endpoints and serves the interface.</w:t>
@@ -576,7 +1689,9 @@
           </w:tcPr>
           <w:p>
             <w:pPr>
-              <w:spacing w:after="40" w:line="264" w:lineRule="auto"/>
+              <w:keepNext/>
+              <w:keepLines/>
+              <w:spacing w:after="60"/>
             </w:pPr>
             <w:r>
               <w:t>HTML and CSS</w:t>
@@ -602,7 +1717,9 @@
           </w:tcPr>
           <w:p>
             <w:pPr>
-              <w:spacing w:after="40" w:line="264" w:lineRule="auto"/>
+              <w:keepNext/>
+              <w:keepLines/>
+              <w:spacing w:after="60"/>
             </w:pPr>
             <w:r>
               <w:t>Builds the command editor, file trees and conversion views.</w:t>
@@ -634,7 +1751,9 @@
           </w:tcPr>
           <w:p>
             <w:pPr>
-              <w:spacing w:after="40" w:line="264" w:lineRule="auto"/>
+              <w:keepNext/>
+              <w:keepLines/>
+              <w:spacing w:after="60"/>
             </w:pPr>
             <w:r>
               <w:t>Node.js built-in modules</w:t>
@@ -660,7 +1779,9 @@
           </w:tcPr>
           <w:p>
             <w:pPr>
-              <w:spacing w:after="40" w:line="264" w:lineRule="auto"/>
+              <w:keepNext/>
+              <w:keepLines/>
+              <w:spacing w:after="60"/>
             </w:pPr>
             <w:r>
               <w:t>File operations, path handling, hashing and automated tests.</w:t>
@@ -692,7 +1813,8 @@
           </w:tcPr>
           <w:p>
             <w:pPr>
-              <w:spacing w:after="40" w:line="264" w:lineRule="auto"/>
+              <w:keepLines/>
+              <w:spacing w:after="60"/>
             </w:pPr>
             <w:r>
               <w:t>Git and a web browser</w:t>
@@ -718,7 +1840,8 @@
           </w:tcPr>
           <w:p>
             <w:pPr>
-              <w:spacing w:after="40" w:line="264" w:lineRule="auto"/>
+              <w:keepLines/>
+              <w:spacing w:after="60"/>
             </w:pPr>
             <w:r>
               <w:t>Tracks source changes and runs the local application.</w:t>
@@ -738,14 +1861,18 @@
     <w:p>
       <w:pPr>
         <w:pStyle w:val="ReportTopic"/>
-      </w:pPr>
+        <w:keepLines/>
+      </w:pPr>
+      <w:bookmarkStart w:id="3" w:name="cmdprelude_topic_4"/>
       <w:r>
         <w:t>Highlights or features of the project</w:t>
       </w:r>
+      <w:bookmarkEnd w:id="3"/>
     </w:p>
     <w:p>
       <w:pPr>
         <w:pStyle w:val="ListBullet"/>
+        <w:keepNext/>
         <w:keepLines/>
       </w:pPr>
       <w:r>
@@ -755,6 +1882,8 @@
     <w:p>
       <w:pPr>
         <w:pStyle w:val="ListBullet"/>
+        <w:keepNext/>
+        <w:keepLines/>
       </w:pPr>
       <w:r>
         <w:t>Basic mode supports ls, mkdir, cp, mv and rm with simple arguments. Advanced mode adds selected flags, pipes, conditional chains and nested groups.</w:t>
@@ -763,6 +1892,8 @@
     <w:p>
       <w:pPr>
         <w:pStyle w:val="ListBullet"/>
+        <w:keepNext/>
+        <w:keepLines/>
       </w:pPr>
       <w:r>
         <w:t>The Command conversions tab shows the authored grammar, simplification stages, CNF, parse tree and actual CYK steps.</w:t>
@@ -771,6 +1902,8 @@
     <w:p>
       <w:pPr>
         <w:pStyle w:val="ListBullet"/>
+        <w:keepNext/>
+        <w:keepLines/>
       </w:pPr>
       <w:r>
         <w:t>Grammar presets and an editable grammar let users compare how rules change command acceptance.</w:t>
@@ -779,6 +1912,8 @@
     <w:p>
       <w:pPr>
         <w:pStyle w:val="ListBullet"/>
+        <w:keepNext/>
+        <w:keepLines/>
       </w:pPr>
       <w:r>
         <w:t>Syntax recovery suggests small corrections for unfinished quotes, unmatched parentheses and misplaced connectors.</w:t>
@@ -787,6 +1922,7 @@
     <w:p>
       <w:pPr>
         <w:pStyle w:val="ListBullet"/>
+        <w:keepLines/>
       </w:pPr>
       <w:r>
         <w:t>Local folders can be opened by browsing or pasting a path. Supported changes are applied only after review.</w:t>
@@ -805,119 +1941,146 @@
         <w:keepLines/>
       </w:pPr>
       <w:r>
+        <w:t>Virtual keep, undo and reset support repeated experiments on the sample workspace. The execution trace records successful steps, errors and branches that were skipped. For example, in a chain joined by &amp;&amp;, failure of the first command prevents the following command from running. A chain joined by || can instead demonstrate a fallback after failure.</w:t>
+      </w:r>
+    </w:p>
+    <w:p>
+      <w:pPr>
+        <w:keepLines/>
+      </w:pPr>
+      <w:r>
+        <w:t>For classroom demonstrations, these views connect each accepted or rejected command to the rules used to analyse it. Users can follow the same input from its token classes to its tree and execution trace, making the difference between valid syntax and successful workspace operations visible.</w:t>
+      </w:r>
+    </w:p>
+    <w:p>
+      <w:pPr>
+        <w:pStyle w:val="ReportTopic"/>
+        <w:keepLines/>
+      </w:pPr>
+      <w:bookmarkStart w:id="4" w:name="cmdprelude_topic_5"/>
+      <w:r>
         <w:lastRenderedPageBreak/>
-        <w:t>Virtual keep, undo and reset support repeated experiments on the sample workspace. The execution trace records successful steps, errors and branches that were skipped. For example, in a chain joined by &amp;&amp;, failure of the first command prevents the following command from running. A chain joined by || can instead demonstrate a fallback after failure.</w:t>
+        <w:t>Project Modules</w:t>
+      </w:r>
+      <w:bookmarkEnd w:id="4"/>
+    </w:p>
+    <w:p>
+      <w:pPr>
+        <w:keepLines/>
+      </w:pPr>
+      <w:r>
+        <w:t>The project is organized into eight functional modules that handle command input, grammar processing, parsing, simulation, error recovery and user interaction. Command analysis and suggested syntax corrections use the same grammar pipeline</w:t>
+      </w:r>
+    </w:p>
+    <w:p>
+      <w:pPr>
+        <w:pStyle w:val="ListBullet"/>
+        <w:keepNext/>
+        <w:keepLines/>
+      </w:pPr>
+      <w:r>
+        <w:t>Command input and tokeni</w:t>
+      </w:r>
+      <w:r>
+        <w:t>z</w:t>
+      </w:r>
+      <w:r>
+        <w:t>ation</w:t>
+      </w:r>
+    </w:p>
+    <w:p>
+      <w:pPr>
+        <w:pStyle w:val="ListBullet"/>
+        <w:keepNext/>
+        <w:keepLines/>
+      </w:pPr>
+      <w:r>
+        <w:t>Grammar definition and validation</w:t>
+      </w:r>
+    </w:p>
+    <w:p>
+      <w:pPr>
+        <w:pStyle w:val="ListBullet"/>
+        <w:keepNext/>
+        <w:keepLines/>
+      </w:pPr>
+      <w:r>
+        <w:t>Grammar simplification and CNF conversion</w:t>
+      </w:r>
+    </w:p>
+    <w:p>
+      <w:pPr>
+        <w:pStyle w:val="ListBullet"/>
+        <w:keepNext/>
+        <w:keepLines/>
+      </w:pPr>
+      <w:r>
+        <w:t>CYK parsing and tree reconstruction</w:t>
+      </w:r>
+    </w:p>
+    <w:p>
+      <w:pPr>
+        <w:pStyle w:val="ListBullet"/>
+        <w:keepNext/>
+        <w:keepLines/>
+      </w:pPr>
+      <w:r>
+        <w:t>Command interpretation and file change simulation</w:t>
+      </w:r>
+    </w:p>
+    <w:p>
+      <w:pPr>
+        <w:pStyle w:val="ListBullet"/>
+        <w:keepNext/>
+        <w:keepLines/>
+      </w:pPr>
+      <w:r>
+        <w:t>Error detection and recovery</w:t>
+      </w:r>
+    </w:p>
+    <w:p>
+      <w:pPr>
+        <w:pStyle w:val="ListBullet"/>
+        <w:keepNext/>
+        <w:keepLines/>
+      </w:pPr>
+      <w:r>
+        <w:t>Workspace import and reviewed local file operations</w:t>
+      </w:r>
+    </w:p>
+    <w:p>
+      <w:pPr>
+        <w:pStyle w:val="ListBullet"/>
+        <w:keepLines/>
+      </w:pPr>
+      <w:r>
+        <w:t>Interface and API integration</w:t>
       </w:r>
     </w:p>
     <w:p>
       <w:pPr>
         <w:pStyle w:val="ReportTopic"/>
-      </w:pPr>
-      <w:r>
-        <w:t>Project Modules</w:t>
-      </w:r>
-    </w:p>
-    <w:p>
-      <w:pPr>
-        <w:keepLines/>
-      </w:pPr>
-      <w:r>
-        <w:t>The project is organized into eight functional modules that handle command input, grammar processing, parsing, simulation, error recovery and user interaction. Command analysis and suggested syntax corrections use the same grammar pipeline</w:t>
-      </w:r>
-    </w:p>
-    <w:p>
-      <w:pPr>
-        <w:pStyle w:val="ListBullet"/>
-      </w:pPr>
-      <w:r>
-        <w:t>Command input and tokeni</w:t>
-      </w:r>
-      <w:r>
-        <w:t>z</w:t>
-      </w:r>
-      <w:r>
-        <w:t>ation</w:t>
-      </w:r>
-    </w:p>
-    <w:p>
-      <w:pPr>
-        <w:pStyle w:val="ListBullet"/>
-      </w:pPr>
-      <w:r>
-        <w:t>Grammar definition and validation</w:t>
-      </w:r>
-    </w:p>
-    <w:p>
-      <w:pPr>
-        <w:pStyle w:val="ListBullet"/>
-      </w:pPr>
-      <w:r>
-        <w:t>Grammar simplification and CNF conversion</w:t>
-      </w:r>
-    </w:p>
-    <w:p>
-      <w:pPr>
-        <w:pStyle w:val="ListBullet"/>
-      </w:pPr>
-      <w:r>
-        <w:t>CYK parsing and tree reconstruction</w:t>
-      </w:r>
-    </w:p>
-    <w:p>
-      <w:pPr>
-        <w:pStyle w:val="ListBullet"/>
-      </w:pPr>
-      <w:r>
-        <w:t>Command interpretation and file change simulation</w:t>
-      </w:r>
-    </w:p>
-    <w:p>
-      <w:pPr>
-        <w:pStyle w:val="ListBullet"/>
-      </w:pPr>
-      <w:r>
-        <w:t>Error detection and recovery</w:t>
-      </w:r>
-    </w:p>
-    <w:p>
-      <w:pPr>
-        <w:pStyle w:val="ListBullet"/>
-      </w:pPr>
-      <w:r>
-        <w:t>Workspace import and reviewed local file operations</w:t>
-      </w:r>
-    </w:p>
-    <w:p>
-      <w:pPr>
-        <w:pStyle w:val="ListBullet"/>
-      </w:pPr>
-      <w:r>
-        <w:t>Interface and API integration</w:t>
-      </w:r>
-    </w:p>
-    <w:p>
-      <w:pPr>
-        <w:pStyle w:val="ReportTopic"/>
-        <w:pageBreakBefore/>
-      </w:pPr>
-      <w:r>
-        <w:lastRenderedPageBreak/>
+        <w:keepLines/>
+      </w:pPr>
+      <w:bookmarkStart w:id="5" w:name="cmdprelude_topic_6"/>
+      <w:r>
         <w:t>Project Architecture</w:t>
       </w:r>
+      <w:bookmarkEnd w:id="5"/>
+    </w:p>
+    <w:p>
+      <w:pPr>
+        <w:keepLines/>
+      </w:pPr>
+      <w:r>
+        <w:t>The browser sends commands, grammar rules and workspace information to the Express backend. The diagram shows how the analysis modules work together and how reviewed operations reach a real folder.</w:t>
+      </w:r>
     </w:p>
     <w:p>
       <w:pPr>
         <w:keepNext/>
-        <w:spacing w:after="160"/>
-      </w:pPr>
-      <w:r>
-        <w:t>The browser sends commands, grammar rules and workspace information to the Express backend. The diagram shows how the analysis modules work together and how reviewed operations reach a real folder.</w:t>
-      </w:r>
-    </w:p>
-    <w:p>
-      <w:pPr>
-        <w:keepNext/>
-        <w:spacing w:after="120"/>
+        <w:keepLines/>
+        <w:spacing w:after="60"/>
         <w:jc w:val="center"/>
       </w:pPr>
       <w:r>
@@ -925,8 +2088,8 @@
           <w:noProof/>
         </w:rPr>
         <w:drawing>
-          <wp:inline distT="0" distB="0" distL="0" distR="0" wp14:anchorId="098A2D3D" wp14:editId="14F63030">
-            <wp:extent cx="5897880" cy="6119050"/>
+          <wp:inline distT="0" distB="0" distL="0" distR="0" wp14:anchorId="513FB612" wp14:editId="1438BAA4">
+            <wp:extent cx="5349240" cy="5549836"/>
             <wp:effectExtent l="0" t="0" r="0" b="0"/>
             <wp:docPr id="5" name="Picture 5" descr="CmdPrelude architecture showing the browser and Express API, tokenisation, grammar compilation, CYK parsing and tree construction, reparsed syntax corrections, virtual interpretation, analysis results and reviewed real-folder operations."/>
             <wp:cNvGraphicFramePr>
@@ -940,7 +2103,7 @@
                     <pic:cNvPicPr/>
                   </pic:nvPicPr>
                   <pic:blipFill>
-                    <a:blip r:embed="rId8"/>
+                    <a:blip r:embed="rId9"/>
                     <a:stretch>
                       <a:fillRect/>
                     </a:stretch>
@@ -948,7 +2111,7 @@
                   <pic:spPr>
                     <a:xfrm>
                       <a:off x="0" y="0"/>
-                      <a:ext cx="5897880" cy="6119050"/>
+                      <a:ext cx="5349240" cy="5549836"/>
                     </a:xfrm>
                     <a:prstGeom prst="rect">
                       <a:avLst/>
@@ -963,6 +2126,8 @@
     </w:p>
     <w:p>
       <w:pPr>
+        <w:keepLines/>
+        <w:spacing w:after="100"/>
         <w:jc w:val="center"/>
       </w:pPr>
       <w:r>
@@ -976,20 +2141,24 @@
     <w:p>
       <w:pPr>
         <w:pStyle w:val="ReportTopic"/>
-        <w:pageBreakBefore/>
-      </w:pPr>
+        <w:keepLines/>
+      </w:pPr>
+      <w:bookmarkStart w:id="6" w:name="cmdprelude_topic_7"/>
       <w:r>
         <w:lastRenderedPageBreak/>
         <w:t>Module Description</w:t>
       </w:r>
+      <w:bookmarkEnd w:id="6"/>
     </w:p>
     <w:p>
       <w:pPr>
         <w:pStyle w:val="ReportSubtopic"/>
+        <w:keepLines/>
         <w:rPr>
           <w:szCs w:val="28"/>
         </w:rPr>
       </w:pPr>
+      <w:bookmarkStart w:id="7" w:name="cmdprelude_topic_8"/>
       <w:r>
         <w:rPr>
           <w:szCs w:val="28"/>
@@ -1008,6 +2177,7 @@
         </w:rPr>
         <w:t>ation</w:t>
       </w:r>
+      <w:bookmarkEnd w:id="7"/>
     </w:p>
     <w:p>
       <w:pPr>
@@ -1040,38 +2210,25 @@
           <w:szCs w:val="24"/>
           <w:lang w:val="en-IN"/>
         </w:rPr>
-        <w:t xml:space="preserve">The tokens are then classified according to their role in the command. For example, cp notes.txt backup/ is represented as cp path </w:t>
-      </w:r>
-      <w:proofErr w:type="spellStart"/>
-      <w:r>
-        <w:rPr>
-          <w:szCs w:val="24"/>
-          <w:lang w:val="en-IN"/>
-        </w:rPr>
-        <w:t>path</w:t>
-      </w:r>
-      <w:proofErr w:type="spellEnd"/>
-      <w:r>
-        <w:rPr>
-          <w:szCs w:val="24"/>
-          <w:lang w:val="en-IN"/>
-        </w:rPr>
-        <w:t xml:space="preserve"> for grammar checking. This identifies both arguments as paths; whether those paths exist is checked later during interpretation. The application also detects unfinished quotes and rejects unsupported shell syntax.</w:t>
+        <w:t>The tokens are then classified according to their role in the command. For example, cp notes.txt backup/ is represented as cp path path for grammar checking. This identifies both arguments as paths; whether those paths exist is checked later during interpretation. The application also detects unfinished quotes and rejects unsupported shell syntax.</w:t>
       </w:r>
     </w:p>
     <w:p>
       <w:pPr>
         <w:pStyle w:val="ReportSubtopic"/>
+        <w:keepLines/>
         <w:rPr>
           <w:szCs w:val="28"/>
         </w:rPr>
       </w:pPr>
+      <w:bookmarkStart w:id="8" w:name="cmdprelude_topic_9"/>
       <w:r>
         <w:rPr>
           <w:szCs w:val="28"/>
         </w:rPr>
         <w:t>Grammar definition and validation</w:t>
       </w:r>
+      <w:bookmarkEnd w:id="8"/>
     </w:p>
     <w:p>
       <w:pPr>
@@ -1112,16 +2269,19 @@
     <w:p>
       <w:pPr>
         <w:pStyle w:val="ReportSubtopic"/>
+        <w:keepLines/>
         <w:rPr>
           <w:szCs w:val="28"/>
         </w:rPr>
       </w:pPr>
+      <w:bookmarkStart w:id="9" w:name="cmdprelude_topic_10"/>
       <w:r>
         <w:rPr>
           <w:szCs w:val="28"/>
         </w:rPr>
         <w:t>Grammar simplification and CNF conversion</w:t>
       </w:r>
+      <w:bookmarkEnd w:id="9"/>
     </w:p>
     <w:p>
       <w:pPr>
@@ -1154,7 +2314,6 @@
           <w:szCs w:val="24"/>
           <w:lang w:val="en-IN"/>
         </w:rPr>
-        <w:lastRenderedPageBreak/>
         <w:t>Useless-symbol removal eliminates symbols that cannot produce terminal strings or cannot be reached from the start symbol. Epsilon elimination adjusts productions to account for symbols that can produce the empty string. Unit-production removal replaces rules such as A → B with the non-unit productions reachable through B. These transformations preserve the language, with special handling for the empty string where required.</w:t>
       </w:r>
     </w:p>
@@ -1178,16 +2337,20 @@
     <w:p>
       <w:pPr>
         <w:pStyle w:val="ReportSubtopic"/>
+        <w:keepLines/>
         <w:rPr>
           <w:szCs w:val="28"/>
         </w:rPr>
       </w:pPr>
+      <w:bookmarkStart w:id="10" w:name="cmdprelude_topic_11"/>
       <w:r>
         <w:rPr>
           <w:szCs w:val="28"/>
         </w:rPr>
+        <w:lastRenderedPageBreak/>
         <w:t>CYK parsing and tree reconstruction</w:t>
       </w:r>
+      <w:bookmarkEnd w:id="10"/>
     </w:p>
     <w:p>
       <w:pPr>
@@ -1225,11 +2388,13 @@
     <w:p>
       <w:pPr>
         <w:pStyle w:val="ReportSubtopic"/>
+        <w:keepLines/>
         <w:rPr>
           <w:bCs/>
           <w:szCs w:val="28"/>
         </w:rPr>
       </w:pPr>
+      <w:bookmarkStart w:id="11" w:name="cmdprelude_topic_12"/>
       <w:r>
         <w:rPr>
           <w:bCs/>
@@ -1237,6 +2402,7 @@
         </w:rPr>
         <w:t>Command interpretation and file change simulation</w:t>
       </w:r>
+      <w:bookmarkEnd w:id="11"/>
     </w:p>
     <w:p>
       <w:pPr>
@@ -1262,7 +2428,6 @@
         </w:rPr>
       </w:pPr>
       <w:r>
-        <w:lastRenderedPageBreak/>
         <w:t>Pipelines pass the simulated standard output of one command to the next. Conditional chains use exit statuses to decide whether the following command runs: &amp;&amp; continues after success, while || continues after failure. Parenthesi</w:t>
       </w:r>
       <w:r>
@@ -1275,16 +2440,19 @@
     <w:p>
       <w:pPr>
         <w:pStyle w:val="ReportSubtopic"/>
+        <w:keepLines/>
         <w:rPr>
           <w:szCs w:val="28"/>
         </w:rPr>
       </w:pPr>
+      <w:bookmarkStart w:id="12" w:name="cmdprelude_topic_13"/>
       <w:r>
         <w:rPr>
           <w:szCs w:val="28"/>
         </w:rPr>
         <w:t>Error detection and recovery</w:t>
       </w:r>
+      <w:bookmarkEnd w:id="12"/>
     </w:p>
     <w:p>
       <w:pPr>
@@ -1311,67 +2479,42 @@
         <w:rPr>
           <w:lang w:val="en-IN"/>
         </w:rPr>
-        <w:t>For example, cp notes.txt backup/ &amp;&amp; is incomplete because &amp;&amp; requires a command on both sides. Removing the trailing connector produces a candidate that can be parsed again. Similarly, (</w:t>
-      </w:r>
-      <w:proofErr w:type="spellStart"/>
-      <w:r>
+        <w:t>For example, cp notes.txt backup/ &amp;&amp; is incomplete because &amp;&amp; requires a command on both sides. Removing the trailing connector produces a candidate that can be parsed again. Similarly, (pwd has an unmatched opening parenthesis; the application can suggest (pwd) under the Advanced grammar.</w:t>
+      </w:r>
+    </w:p>
+    <w:p>
+      <w:pPr>
+        <w:keepLines/>
         <w:rPr>
           <w:lang w:val="en-IN"/>
         </w:rPr>
-        <w:t>pwd</w:t>
-      </w:r>
-      <w:proofErr w:type="spellEnd"/>
+      </w:pPr>
       <w:r>
         <w:rPr>
           <w:lang w:val="en-IN"/>
         </w:rPr>
-        <w:t xml:space="preserve"> has an unmatched opening parenthesis; the application can suggest (</w:t>
-      </w:r>
-      <w:proofErr w:type="spellStart"/>
-      <w:r>
-        <w:rPr>
-          <w:lang w:val="en-IN"/>
-        </w:rPr>
-        <w:t>pwd</w:t>
-      </w:r>
-      <w:proofErr w:type="spellEnd"/>
-      <w:r>
-        <w:rPr>
-          <w:lang w:val="en-IN"/>
-        </w:rPr>
-        <w:t>) under the Advanced grammar.</w:t>
-      </w:r>
-    </w:p>
-    <w:p>
-      <w:pPr>
-        <w:keepLines/>
-        <w:rPr>
-          <w:lang w:val="en-IN"/>
-        </w:rPr>
-      </w:pPr>
-      <w:r>
-        <w:rPr>
-          <w:lang w:val="en-IN"/>
-        </w:rPr>
         <w:t>The tool does not invent missing file paths or guarantee the smallest possible correction. If cp notes.txt lacks a destination, it explains the required command structure without guessing the destination. A suggested correction fixes syntax only; the corrected command may still fail during interpretation if a file is missing or another workspace condition is not satisfied. Reference [2] provides related background on error-correcting parsing.</w:t>
       </w:r>
     </w:p>
     <w:p>
       <w:pPr>
         <w:pStyle w:val="ReportSubtopic"/>
-        <w:spacing w:line="360" w:lineRule="auto"/>
+        <w:keepLines/>
         <w:rPr>
           <w:bCs/>
           <w:szCs w:val="28"/>
         </w:rPr>
       </w:pPr>
+      <w:bookmarkStart w:id="13" w:name="cmdprelude_topic_14"/>
       <w:r>
         <w:rPr>
           <w:bCs/>
           <w:szCs w:val="28"/>
         </w:rPr>
+        <w:lastRenderedPageBreak/>
         <w:t>Workspace import and reviewed local file operations</w:t>
       </w:r>
+      <w:bookmarkEnd w:id="13"/>
     </w:p>
     <w:p>
       <w:pPr>
@@ -1416,70 +2559,32 @@
           <w:szCs w:val="24"/>
           <w:lang w:val="en-IN"/>
         </w:rPr>
-        <w:t xml:space="preserve">Supported local changes include creating a directory, copying a file, moving or renaming a file or directory, and deleting a file. Advanced chains, pipes and recursive operations remain preview-only for real folders. The local adapter </w:t>
-      </w:r>
-      <w:proofErr w:type="gramStart"/>
-      <w:r>
-        <w:rPr>
-          <w:szCs w:val="24"/>
-          <w:lang w:val="en-IN"/>
-        </w:rPr>
-        <w:t>excludes .git</w:t>
-      </w:r>
-      <w:proofErr w:type="gramEnd"/>
-      <w:r>
-        <w:rPr>
-          <w:szCs w:val="24"/>
-          <w:lang w:val="en-IN"/>
-        </w:rPr>
-        <w:t xml:space="preserve">, </w:t>
-      </w:r>
-      <w:proofErr w:type="spellStart"/>
-      <w:r>
-        <w:rPr>
-          <w:szCs w:val="24"/>
-          <w:lang w:val="en-IN"/>
-        </w:rPr>
-        <w:t>node_modules</w:t>
-      </w:r>
-      <w:proofErr w:type="spellEnd"/>
-      <w:r>
-        <w:rPr>
-          <w:szCs w:val="24"/>
-          <w:lang w:val="en-IN"/>
-        </w:rPr>
-        <w:t xml:space="preserve"> and the application's old backup directory, and rejects symbolic links and special files. Sessions and preview plans are temporary, and each plan can be used only once. Applied changes have no automatic backup or real-folder undo.</w:t>
+        <w:t>Supported local changes include creating a directory, copying a file, moving or renaming a file or directory, and deleting a file. Advanced chains, pipes and recursive operations remain preview-only for real folders. The local adapter excludes .git, node_modules and the application's old backup directory, and rejects symbolic links and special files. Sessions and preview plans are temporary, and each plan can be used only once. Applied changes have no automatic backup or real-folder undo.</w:t>
       </w:r>
     </w:p>
     <w:p>
       <w:pPr>
         <w:pStyle w:val="ReportSubtopic"/>
+        <w:keepLines/>
         <w:rPr>
           <w:szCs w:val="28"/>
         </w:rPr>
       </w:pPr>
+      <w:bookmarkStart w:id="14" w:name="cmdprelude_topic_15"/>
       <w:r>
         <w:rPr>
           <w:szCs w:val="28"/>
         </w:rPr>
-        <w:lastRenderedPageBreak/>
         <w:t>Interface and API integration</w:t>
       </w:r>
-    </w:p>
-    <w:p>
-      <w:pPr>
-        <w:keepLines/>
-      </w:pPr>
-      <w:r>
-        <w:t xml:space="preserve">The application provides two main views: Playground and Command conversions. Playground contains the command editor, workspace trees, proposed file changes, command output, errors and execution trace. Command conversions </w:t>
-      </w:r>
-      <w:proofErr w:type="gramStart"/>
-      <w:r>
-        <w:t>displays</w:t>
-      </w:r>
-      <w:proofErr w:type="gramEnd"/>
-      <w:r>
-        <w:t xml:space="preserve"> the selected grammar, simplification stages, CNF, parse tree and CYK computation for the same command.</w:t>
+      <w:bookmarkEnd w:id="14"/>
+    </w:p>
+    <w:p>
+      <w:pPr>
+        <w:keepLines/>
+      </w:pPr>
+      <w:r>
+        <w:t>The application provides two main views: Playground and Command conversions. Playground contains the command editor, workspace trees, proposed file changes, command output, errors and execution trace. Command conversions displays the selected grammar, simplification stages, CNF, parse tree and CYK computation for the same command.</w:t>
       </w:r>
     </w:p>
     <w:p>
@@ -1505,11 +2610,13 @@
     <w:p>
       <w:pPr>
         <w:pStyle w:val="ReportTopic"/>
+        <w:keepLines/>
         <w:rPr>
           <w:bCs/>
           <w:szCs w:val="32"/>
         </w:rPr>
       </w:pPr>
+      <w:bookmarkStart w:id="15" w:name="cmdprelude_topic_16"/>
       <w:r>
         <w:rPr>
           <w:bCs/>
@@ -1517,6 +2624,7 @@
         </w:rPr>
         <w:t>Role of Team members</w:t>
       </w:r>
+      <w:bookmarkEnd w:id="15"/>
     </w:p>
     <w:tbl>
       <w:tblPr>
@@ -1555,7 +2663,9 @@
           </w:tcPr>
           <w:p>
             <w:pPr>
-              <w:spacing w:after="40" w:line="264" w:lineRule="auto"/>
+              <w:keepNext/>
+              <w:keepLines/>
+              <w:spacing w:after="60"/>
             </w:pPr>
             <w:r>
               <w:rPr>
@@ -1585,7 +2695,9 @@
           </w:tcPr>
           <w:p>
             <w:pPr>
-              <w:spacing w:after="40" w:line="264" w:lineRule="auto"/>
+              <w:keepNext/>
+              <w:keepLines/>
+              <w:spacing w:after="60"/>
             </w:pPr>
             <w:r>
               <w:rPr>
@@ -1620,7 +2732,9 @@
           </w:tcPr>
           <w:p>
             <w:pPr>
-              <w:spacing w:after="40" w:line="264" w:lineRule="auto"/>
+              <w:keepNext/>
+              <w:keepLines/>
+              <w:spacing w:after="60"/>
             </w:pPr>
             <w:r>
               <w:t>Aakash Sinha</w:t>
@@ -1650,7 +2764,9 @@
           </w:tcPr>
           <w:p>
             <w:pPr>
-              <w:spacing w:after="40" w:line="264" w:lineRule="auto"/>
+              <w:keepNext/>
+              <w:keepLines/>
+              <w:spacing w:after="60"/>
             </w:pPr>
             <w:r>
               <w:t>Grammar definition and integration; simplification, CNF and CYK pipeline; command interpretation; backend APIs and local-folder operations.</w:t>
@@ -1682,7 +2798,8 @@
           </w:tcPr>
           <w:p>
             <w:pPr>
-              <w:spacing w:after="40" w:line="264" w:lineRule="auto"/>
+              <w:keepLines/>
+              <w:spacing w:after="60"/>
             </w:pPr>
             <w:r>
               <w:t>Harsheet Ranjan</w:t>
@@ -1712,7 +2829,8 @@
           </w:tcPr>
           <w:p>
             <w:pPr>
-              <w:spacing w:after="40" w:line="264" w:lineRule="auto"/>
+              <w:keepLines/>
+              <w:spacing w:after="60"/>
             </w:pPr>
             <w:r>
               <w:t>Browser interface and file-tree display; conversion visualisations; error-recovery interaction; test cases, screenshots and project documentation.</w:t>
@@ -1723,228 +2841,96 @@
     </w:tbl>
     <w:p>
       <w:pPr>
-        <w:rPr>
-          <w:b/>
+        <w:pStyle w:val="ReportTopic"/>
+        <w:keepLines/>
+        <w:rPr>
           <w:bCs/>
-          <w:sz w:val="32"/>
           <w:szCs w:val="32"/>
         </w:rPr>
       </w:pPr>
-    </w:p>
-    <w:p>
-      <w:pPr>
-        <w:rPr>
-          <w:b/>
+      <w:bookmarkStart w:id="16" w:name="cmdprelude_topic_17"/>
+      <w:r>
+        <w:rPr>
           <w:bCs/>
-          <w:sz w:val="32"/>
           <w:szCs w:val="32"/>
-        </w:rPr>
-      </w:pPr>
-    </w:p>
-    <w:p>
-      <w:pPr>
-        <w:rPr>
-          <w:b/>
-          <w:bCs/>
-          <w:sz w:val="32"/>
-          <w:szCs w:val="32"/>
-        </w:rPr>
-      </w:pPr>
-    </w:p>
-    <w:p>
-      <w:pPr>
-        <w:rPr>
-          <w:b/>
-          <w:bCs/>
-          <w:sz w:val="32"/>
-          <w:szCs w:val="32"/>
-        </w:rPr>
-      </w:pPr>
-    </w:p>
-    <w:p>
-      <w:pPr>
-        <w:rPr>
-          <w:b/>
-          <w:bCs/>
-          <w:sz w:val="32"/>
-          <w:szCs w:val="32"/>
-        </w:rPr>
-      </w:pPr>
-    </w:p>
-    <w:p>
-      <w:pPr>
-        <w:rPr>
-          <w:b/>
-          <w:bCs/>
-          <w:sz w:val="32"/>
-          <w:szCs w:val="32"/>
-        </w:rPr>
-      </w:pPr>
-    </w:p>
-    <w:p>
-      <w:pPr>
-        <w:rPr>
-          <w:b/>
-          <w:bCs/>
-          <w:sz w:val="32"/>
-          <w:szCs w:val="32"/>
-        </w:rPr>
-      </w:pPr>
-    </w:p>
-    <w:p>
-      <w:pPr>
-        <w:rPr>
-          <w:b/>
-          <w:bCs/>
-          <w:sz w:val="32"/>
-          <w:szCs w:val="32"/>
-        </w:rPr>
-      </w:pPr>
-    </w:p>
-    <w:p>
-      <w:pPr>
-        <w:rPr>
-          <w:b/>
-          <w:bCs/>
-          <w:sz w:val="32"/>
-          <w:szCs w:val="32"/>
-        </w:rPr>
-      </w:pPr>
-    </w:p>
-    <w:p>
-      <w:pPr>
-        <w:rPr>
-          <w:b/>
-          <w:bCs/>
-          <w:sz w:val="32"/>
-          <w:szCs w:val="32"/>
-        </w:rPr>
-      </w:pPr>
-    </w:p>
-    <w:p>
-      <w:pPr>
-        <w:rPr>
-          <w:b/>
-          <w:bCs/>
-          <w:sz w:val="32"/>
-          <w:szCs w:val="32"/>
-          <w:u w:val="single"/>
-        </w:rPr>
-      </w:pPr>
-      <w:r>
-        <w:rPr>
-          <w:b/>
-          <w:bCs/>
-          <w:sz w:val="32"/>
-          <w:szCs w:val="32"/>
-          <w:u w:val="single"/>
         </w:rPr>
         <w:lastRenderedPageBreak/>
         <w:t>Software description</w:t>
       </w:r>
-    </w:p>
-    <w:p>
-      <w:pPr>
-        <w:keepLines/>
-      </w:pPr>
-      <w:proofErr w:type="spellStart"/>
-      <w:r>
-        <w:t>CmdPrelude</w:t>
-      </w:r>
-      <w:proofErr w:type="spellEnd"/>
-      <w:r>
-        <w:t xml:space="preserve"> is a web application built with HTML, CSS and JavaScript for the frontend and Node.js with Express for the backend. The frontend provides the command editor, file views and parsing </w:t>
-      </w:r>
-      <w:proofErr w:type="spellStart"/>
-      <w:r>
-        <w:t>visualisations</w:t>
-      </w:r>
-      <w:proofErr w:type="spellEnd"/>
-      <w:r>
-        <w:t>. Express serves the interface and handles requests between the browser and the analysis modules [7]. The application does not require a database; workspace sessions and preview plans are stored temporarily in memory.</w:t>
-      </w:r>
-    </w:p>
-    <w:p>
-      <w:pPr>
-        <w:keepLines/>
-      </w:pPr>
-      <w:r>
-        <w:t>Users can experiment with a sample workspace or open a folder from their computer. The interface provides Basic mode for simple commands and Advanced mode for selected flags, conditional chains, pipelines and nested command groups.</w:t>
-      </w:r>
-    </w:p>
-    <w:p>
-      <w:pPr>
-        <w:keepLines/>
-      </w:pPr>
-      <w:r>
-        <w:t xml:space="preserve">When a command is submitted, the backend separates it into tokens, checks it against the selected grammar and processes it through grammar simplification, CNF conversion and CYK parsing. A separate interpreter follows the resulting parse structure to calculate command output, errors and proposed file changes. The browser presents these results through file trees, an execution trace and grammar </w:t>
-      </w:r>
-      <w:proofErr w:type="spellStart"/>
-      <w:r>
-        <w:t>visualisations</w:t>
-      </w:r>
-      <w:proofErr w:type="spellEnd"/>
-      <w:r>
-        <w:t>.</w:t>
-      </w:r>
-    </w:p>
-    <w:p>
-      <w:pPr>
-        <w:keepLines/>
-      </w:pPr>
-      <w:r>
-        <w:t>Previewing does not execute the entered command in the operating system. Supported changes to a real folder require explicit review and application. The folder adapter performs these operations through Node.js filesystem functions. Virtual undo applies only to the virtual workspace and cannot reverse changes already applied to a real folder.</w:t>
-      </w:r>
-    </w:p>
-    <w:p>
-      <w:pPr>
-        <w:keepLines/>
-      </w:pPr>
-      <w:r>
-        <w:t>The supported command language is limited to 512 characters and 40 tokens per input. Variables, wildcard expansion, command substitution, redirection and arbitrary external programs are not supported. Applying changes to real folders is limited to selected individual Basic operations.</w:t>
-      </w:r>
-    </w:p>
-    <w:p>
-      <w:pPr>
-        <w:keepLines/>
-      </w:pPr>
-      <w:r>
-        <w:t>Automated tests check grammar parsing, simplification, CNF conversion, CYK recognition, ambiguity and tree reconstruction. Additional tests cover command simulation, syntax recovery and file operations, including checks for changes made after a preview.</w:t>
+      <w:bookmarkEnd w:id="16"/>
+    </w:p>
+    <w:p>
+      <w:pPr>
+        <w:keepNext/>
+        <w:keepLines/>
+      </w:pPr>
+      <w:r>
+        <w:t>CmdPrelude uses HTML, CSS and JavaScript for the browser interface and Node.js with Express for the backend [7]. The interface provides a command editor, file trees, output and grammar visualisations. Express serves the application and handles analysis requests. No database is required; virtual history, folder sessions and preview plans are held in memory.</w:t>
+      </w:r>
+    </w:p>
+    <w:p>
+      <w:pPr>
+        <w:keepNext/>
+        <w:keepLines/>
+      </w:pPr>
+      <w:r>
+        <w:t>The backend tokenises each input, validates the selected grammar, and processes it through simplification, CNF conversion and CYK parsing. A separate interpreter follows the reconstructed structure to calculate output, errors and file changes. Previewing does not execute command text in the operating system.</w:t>
+      </w:r>
+    </w:p>
+    <w:p>
+      <w:pPr>
+        <w:keepNext/>
+        <w:keepLines/>
+      </w:pPr>
+      <w:r>
+        <w:t>Inputs are limited to 512 characters and 40 tokens. Variables, wildcard expansion, command substitution, redirection and arbitrary external programs are unsupported. Advanced groups, chains and pipelines are modelled in previews. Automated checks cover the grammar pipeline, interpretation, recovery, tree rendering and local-folder operations.</w:t>
+      </w:r>
+    </w:p>
+    <w:p>
+      <w:pPr>
+        <w:keepLines/>
+      </w:pPr>
+      <w:r>
+        <w:t>Real-folder changes require explicit review and use Node.js filesystem functions. Only selected individual Basic operations can be applied. Preview fingerprints detect changes made since analysis. Virtual undo affects the virtual workspace and cannot reverse an operation already applied to a real folder.</w:t>
       </w:r>
     </w:p>
     <w:p>
       <w:pPr>
         <w:pStyle w:val="ReportTopic"/>
-        <w:pageBreakBefore/>
+        <w:keepLines/>
         <w:rPr>
           <w:bCs/>
           <w:szCs w:val="32"/>
         </w:rPr>
       </w:pPr>
+      <w:bookmarkStart w:id="17" w:name="cmdprelude_topic_18"/>
       <w:r>
         <w:rPr>
           <w:bCs/>
           <w:szCs w:val="32"/>
         </w:rPr>
-        <w:lastRenderedPageBreak/>
         <w:t>Coding</w:t>
       </w:r>
-    </w:p>
-    <w:p>
-      <w:pPr>
-        <w:keepLines/>
-      </w:pPr>
-      <w:r>
-        <w:t>The following code excerpts show how the current application defines its command language, prepares the grammar, checks command structure and validates repair suggestions. These are selected parts of the implementation rather than complete source files. Existing grammar-processing functions are reused throughout the command analysis pipeline.</w:t>
+      <w:bookmarkEnd w:id="17"/>
+    </w:p>
+    <w:p>
+      <w:pPr>
+        <w:keepLines/>
+      </w:pPr>
+      <w:r>
+        <w:t>The excerpts below show the main implementation stages. They are selected statements rather than complete source files; the existing grammar algorithms are reused throughout command analysis.</w:t>
       </w:r>
     </w:p>
     <w:p>
       <w:pPr>
         <w:pStyle w:val="ReportSubtopic"/>
-      </w:pPr>
+        <w:keepLines/>
+      </w:pPr>
+      <w:bookmarkStart w:id="18" w:name="cmdprelude_topic_19"/>
       <w:r>
         <w:t>Basic command grammar</w:t>
       </w:r>
+      <w:bookmarkEnd w:id="18"/>
     </w:p>
     <w:p>
       <w:pPr>
@@ -1952,7 +2938,7 @@
         <w:keepLines/>
       </w:pPr>
       <w:r>
-        <w:t>Source file: src/core/commandGrammar.js. The Basic grammar defines five commands: ls, mkdir, cp, mv and rm. PATH represents a path argument. The rules check the command structure; whether a path exists is checked later by the interpreter.</w:t>
+        <w:t>Source: src/core/commandGrammar.js. Basic mode defines ls, mkdir, cp, mv and rm. PATH represents a path argument; file existence is checked later by the interpreter.</w:t>
       </w:r>
     </w:p>
     <w:p>
@@ -1960,8 +2946,13 @@
         <w:pStyle w:val="SourceCode"/>
         <w:keepNext/>
         <w:keepLines/>
-      </w:pPr>
-      <w:r>
+        <w:spacing w:line="230" w:lineRule="exact"/>
+      </w:pPr>
+      <w:r>
+        <w:rPr>
+          <w:rFonts w:ascii="Consolas" w:hAnsi="Consolas"/>
+          <w:sz w:val="21"/>
+        </w:rPr>
         <w:t>export const BASIC_GRAMMAR = `</w:t>
       </w:r>
     </w:p>
@@ -1970,8 +2961,13 @@
         <w:pStyle w:val="SourceCode"/>
         <w:keepNext/>
         <w:keepLines/>
-      </w:pPr>
-      <w:r>
+        <w:spacing w:line="230" w:lineRule="exact"/>
+      </w:pPr>
+      <w:r>
+        <w:rPr>
+          <w:rFonts w:ascii="Consolas" w:hAnsi="Consolas"/>
+          <w:sz w:val="21"/>
+        </w:rPr>
         <w:t>COMMAND -&gt; LIST | MAKE | COPY | MOVE | DELETE</w:t>
       </w:r>
     </w:p>
@@ -1980,8 +2976,13 @@
         <w:pStyle w:val="SourceCode"/>
         <w:keepNext/>
         <w:keepLines/>
-      </w:pPr>
-      <w:r>
+        <w:spacing w:line="230" w:lineRule="exact"/>
+      </w:pPr>
+      <w:r>
+        <w:rPr>
+          <w:rFonts w:ascii="Consolas" w:hAnsi="Consolas"/>
+          <w:sz w:val="21"/>
+        </w:rPr>
         <w:t>LIST -&gt; ls | ls PATH</w:t>
       </w:r>
     </w:p>
@@ -1990,8 +2991,13 @@
         <w:pStyle w:val="SourceCode"/>
         <w:keepNext/>
         <w:keepLines/>
-      </w:pPr>
-      <w:r>
+        <w:spacing w:line="230" w:lineRule="exact"/>
+      </w:pPr>
+      <w:r>
+        <w:rPr>
+          <w:rFonts w:ascii="Consolas" w:hAnsi="Consolas"/>
+          <w:sz w:val="21"/>
+        </w:rPr>
         <w:t>MAKE -&gt; mkdir PATH</w:t>
       </w:r>
     </w:p>
@@ -2000,8 +3006,13 @@
         <w:pStyle w:val="SourceCode"/>
         <w:keepNext/>
         <w:keepLines/>
-      </w:pPr>
-      <w:r>
+        <w:spacing w:line="230" w:lineRule="exact"/>
+      </w:pPr>
+      <w:r>
+        <w:rPr>
+          <w:rFonts w:ascii="Consolas" w:hAnsi="Consolas"/>
+          <w:sz w:val="21"/>
+        </w:rPr>
         <w:t>COPY -&gt; cp PATH PATH</w:t>
       </w:r>
     </w:p>
@@ -2010,8 +3021,13 @@
         <w:pStyle w:val="SourceCode"/>
         <w:keepNext/>
         <w:keepLines/>
-      </w:pPr>
-      <w:r>
+        <w:spacing w:line="230" w:lineRule="exact"/>
+      </w:pPr>
+      <w:r>
+        <w:rPr>
+          <w:rFonts w:ascii="Consolas" w:hAnsi="Consolas"/>
+          <w:sz w:val="21"/>
+        </w:rPr>
         <w:t>MOVE -&gt; mv PATH PATH</w:t>
       </w:r>
     </w:p>
@@ -2020,8 +3036,13 @@
         <w:pStyle w:val="SourceCode"/>
         <w:keepNext/>
         <w:keepLines/>
-      </w:pPr>
-      <w:r>
+        <w:spacing w:line="230" w:lineRule="exact"/>
+      </w:pPr>
+      <w:r>
+        <w:rPr>
+          <w:rFonts w:ascii="Consolas" w:hAnsi="Consolas"/>
+          <w:sz w:val="21"/>
+        </w:rPr>
         <w:t>DELETE -&gt; rm PATH</w:t>
       </w:r>
     </w:p>
@@ -2029,18 +3050,26 @@
       <w:pPr>
         <w:pStyle w:val="SourceCode"/>
         <w:keepLines/>
-      </w:pPr>
-      <w:r>
+        <w:spacing w:line="230" w:lineRule="exact"/>
+      </w:pPr>
+      <w:r>
+        <w:rPr>
+          <w:rFonts w:ascii="Consolas" w:hAnsi="Consolas"/>
+          <w:sz w:val="21"/>
+        </w:rPr>
         <w:t>PATH -&gt; path`;</w:t>
       </w:r>
     </w:p>
     <w:p>
       <w:pPr>
         <w:pStyle w:val="ReportSubtopic"/>
-      </w:pPr>
+        <w:keepLines/>
+      </w:pPr>
+      <w:bookmarkStart w:id="19" w:name="cmdprelude_topic_20"/>
       <w:r>
         <w:t>Grammar compilation</w:t>
       </w:r>
+      <w:bookmarkEnd w:id="19"/>
     </w:p>
     <w:p>
       <w:pPr>
@@ -2048,7 +3077,7 @@
         <w:keepLines/>
       </w:pPr>
       <w:r>
-        <w:t>Source file: src/core/commandGrammar.js. The following selected statements show grammar parsing, simplification and CNF conversion. In the complete compileCommandGrammar function, validation checks reject invalid grammars before later steps run. Error-handling branches and result construction are omitted from this excerpt.</w:t>
+        <w:t>Source: src/core/commandGrammar.js. These statements parse, simplify and convert a grammar to CNF. The complete function validates each stage; error branches and result construction are omitted here.</w:t>
       </w:r>
     </w:p>
     <w:p>
@@ -2056,8 +3085,13 @@
         <w:pStyle w:val="SourceCode"/>
         <w:keepNext/>
         <w:keepLines/>
-      </w:pPr>
-      <w:r>
+        <w:spacing w:line="230" w:lineRule="exact"/>
+      </w:pPr>
+      <w:r>
+        <w:rPr>
+          <w:rFonts w:ascii="Consolas" w:hAnsi="Consolas"/>
+          <w:sz w:val="21"/>
+        </w:rPr>
         <w:t>const parsed = parseGrammar(</w:t>
       </w:r>
     </w:p>
@@ -2066,8 +3100,13 @@
         <w:pStyle w:val="SourceCode"/>
         <w:keepNext/>
         <w:keepLines/>
-      </w:pPr>
-      <w:r>
+        <w:spacing w:line="230" w:lineRule="exact"/>
+      </w:pPr>
+      <w:r>
+        <w:rPr>
+          <w:rFonts w:ascii="Consolas" w:hAnsi="Consolas"/>
+          <w:sz w:val="21"/>
+        </w:rPr>
         <w:t xml:space="preserve">  text, { strictNonTerminals: true });</w:t>
       </w:r>
     </w:p>
@@ -2076,8 +3115,13 @@
         <w:pStyle w:val="SourceCode"/>
         <w:keepNext/>
         <w:keepLines/>
-      </w:pPr>
-      <w:r>
+        <w:spacing w:line="230" w:lineRule="exact"/>
+      </w:pPr>
+      <w:r>
+        <w:rPr>
+          <w:rFonts w:ascii="Consolas" w:hAnsi="Consolas"/>
+          <w:sz w:val="21"/>
+        </w:rPr>
         <w:t>const grammar = parsed.grammar;</w:t>
       </w:r>
     </w:p>
@@ -2086,37 +3130,50 @@
         <w:pStyle w:val="SourceCode"/>
         <w:keepNext/>
         <w:keepLines/>
-      </w:pPr>
-      <w:r>
+        <w:spacing w:line="230" w:lineRule="exact"/>
+      </w:pPr>
+      <w:r>
+        <w:rPr>
+          <w:rFonts w:ascii="Consolas" w:hAnsi="Consolas"/>
+          <w:sz w:val="21"/>
+        </w:rPr>
         <w:t>const simplified = simplifyGrammar(grammar);</w:t>
       </w:r>
     </w:p>
     <w:p>
       <w:pPr>
         <w:pStyle w:val="SourceCode"/>
-        <w:keepLines/>
-      </w:pPr>
-      <w:r>
+        <w:keepNext/>
+        <w:keepLines/>
+        <w:spacing w:line="230" w:lineRule="exact"/>
+      </w:pPr>
+      <w:r>
+        <w:rPr>
+          <w:rFonts w:ascii="Consolas" w:hAnsi="Consolas"/>
+          <w:sz w:val="21"/>
+        </w:rPr>
         <w:t>const cnf = convertToCNF(simplified.final);</w:t>
       </w:r>
     </w:p>
     <w:p>
       <w:pPr>
         <w:keepLines/>
-        <w:spacing w:before="140"/>
-      </w:pPr>
-      <w:r>
-        <w:t>The compiled result contains the grammar stages used by the parser and the interface. A cache retains up to eight compiled grammars so that repeated previews can reuse the same transformation results. Size limits are checked before and after simplification.</w:t>
+      </w:pPr>
+      <w:r>
+        <w:t>The compiled result supplies the grammar stages shown in the interface. A cache holds up to eight compiled grammars, with size limits checked before and after simplification.</w:t>
       </w:r>
     </w:p>
     <w:p>
       <w:pPr>
         <w:pStyle w:val="ReportSubtopic"/>
-      </w:pPr>
+        <w:keepLines/>
+      </w:pPr>
+      <w:bookmarkStart w:id="20" w:name="cmdprelude_topic_21"/>
       <w:r>
         <w:lastRenderedPageBreak/>
         <w:t>CYK recognition and tree reconstruction</w:t>
       </w:r>
+      <w:bookmarkEnd w:id="20"/>
     </w:p>
     <w:p>
       <w:pPr>
@@ -2124,7 +3181,7 @@
         <w:keepLines/>
       </w:pPr>
       <w:r>
-        <w:t>Source file: src/core/commandSimulator.js. In parseCommand, classified tokens are passed to CYK using their token classes. The statements below are selected from the function. Tree reconstruction takes place only after the complete rejection branch has returned for invalid input.</w:t>
+        <w:t>Source: src/core/commandSimulator.js. parseCommand passes classified tokens to CYK. Tree reconstruction runs only after the rejection branch has returned for invalid input.</w:t>
       </w:r>
     </w:p>
     <w:p>
@@ -2132,8 +3189,13 @@
         <w:pStyle w:val="SourceCode"/>
         <w:keepNext/>
         <w:keepLines/>
-      </w:pPr>
-      <w:r>
+        <w:spacing w:line="230" w:lineRule="exact"/>
+      </w:pPr>
+      <w:r>
+        <w:rPr>
+          <w:rFonts w:ascii="Consolas" w:hAnsi="Consolas"/>
+          <w:sz w:val="21"/>
+        </w:rPr>
         <w:t>const tokens = classifyCommandTokens(lexical.tokens);</w:t>
       </w:r>
     </w:p>
@@ -2142,8 +3204,13 @@
         <w:pStyle w:val="SourceCode"/>
         <w:keepNext/>
         <w:keepLines/>
-      </w:pPr>
-      <w:r>
+        <w:spacing w:line="230" w:lineRule="exact"/>
+      </w:pPr>
+      <w:r>
+        <w:rPr>
+          <w:rFonts w:ascii="Consolas" w:hAnsi="Consolas"/>
+          <w:sz w:val="21"/>
+        </w:rPr>
         <w:t>const normalized = tokens.map(</w:t>
       </w:r>
     </w:p>
@@ -2152,8 +3219,13 @@
         <w:pStyle w:val="SourceCode"/>
         <w:keepNext/>
         <w:keepLines/>
-      </w:pPr>
-      <w:r>
+        <w:spacing w:line="230" w:lineRule="exact"/>
+      </w:pPr>
+      <w:r>
+        <w:rPr>
+          <w:rFonts w:ascii="Consolas" w:hAnsi="Consolas"/>
+          <w:sz w:val="21"/>
+        </w:rPr>
         <w:t xml:space="preserve">  token =&gt; token.class).join(' ');</w:t>
       </w:r>
     </w:p>
@@ -2162,8 +3234,13 @@
         <w:pStyle w:val="SourceCode"/>
         <w:keepNext/>
         <w:keepLines/>
-      </w:pPr>
-      <w:r>
+        <w:spacing w:line="230" w:lineRule="exact"/>
+      </w:pPr>
+      <w:r>
+        <w:rPr>
+          <w:rFonts w:ascii="Consolas" w:hAnsi="Consolas"/>
+          <w:sz w:val="21"/>
+        </w:rPr>
         <w:t>const cyk = cykParse(compiled.cnf.final, normalized);</w:t>
       </w:r>
     </w:p>
@@ -2172,8 +3249,13 @@
         <w:pStyle w:val="SourceCode"/>
         <w:keepNext/>
         <w:keepLines/>
-      </w:pPr>
-      <w:r>
+        <w:spacing w:line="230" w:lineRule="exact"/>
+      </w:pPr>
+      <w:r>
+        <w:rPr>
+          <w:rFonts w:ascii="Consolas" w:hAnsi="Consolas"/>
+          <w:sz w:val="21"/>
+        </w:rPr>
         <w:t>// Only after the input has passed the rejection branch:</w:t>
       </w:r>
     </w:p>
@@ -2182,8 +3264,13 @@
         <w:pStyle w:val="SourceCode"/>
         <w:keepNext/>
         <w:keepLines/>
-      </w:pPr>
-      <w:r>
+        <w:spacing w:line="230" w:lineRule="exact"/>
+      </w:pPr>
+      <w:r>
+        <w:rPr>
+          <w:rFonts w:ascii="Consolas" w:hAnsi="Consolas"/>
+          <w:sz w:val="21"/>
+        </w:rPr>
         <w:t>const raw = buildTrees(cyk, 1)[0];</w:t>
       </w:r>
     </w:p>
@@ -2192,43 +3279,14 @@
         <w:pStyle w:val="SourceCode"/>
         <w:keepNext/>
         <w:keepLines/>
-      </w:pPr>
-      <w:r>
+        <w:spacing w:line="230" w:lineRule="exact"/>
+      </w:pPr>
+      <w:r>
+        <w:rPr>
+          <w:rFonts w:ascii="Consolas" w:hAnsi="Consolas"/>
+          <w:sz w:val="21"/>
+        </w:rPr>
         <w:t>const tree = collapseCNFArtifacts(</w:t>
-      </w:r>
-    </w:p>
-    <w:p>
-      <w:pPr>
-        <w:pStyle w:val="SourceCode"/>
-        <w:keepLines/>
-      </w:pPr>
-      <w:r>
-        <w:t xml:space="preserve">  raw, compiled.cnf.trace);</w:t>
-      </w:r>
-    </w:p>
-    <w:p>
-      <w:pPr>
-        <w:keepLines/>
-        <w:spacing w:before="140"/>
-      </w:pPr>
-      <w:r>
-        <w:t>For cp notes.txt backup/, the grammar checks the sequence cp path path. The interpreter then checks the source and destination in the current workspace. A command can therefore pass the grammar and still report a runtime error.</w:t>
-      </w:r>
-    </w:p>
-    <w:p>
-      <w:pPr>
-        <w:keepLines/>
-      </w:pPr>
-      <w:r>
-        <w:t>After reconstruction, the function restores the original command words and attaches token indexes to the tree. These indexes connect tree nodes to the correct occurrences in the input, even when a word is repeated. The interpreter derives command grouping from this tree.</w:t>
-      </w:r>
-    </w:p>
-    <w:p>
-      <w:pPr>
-        <w:pStyle w:val="ReportSubtopic"/>
-      </w:pPr>
-      <w:r>
-        <w:t>Nested command groups</w:t>
       </w:r>
     </w:p>
     <w:p>
@@ -2236,55 +3294,48 @@
         <w:pStyle w:val="SourceCode"/>
         <w:keepNext/>
         <w:keepLines/>
-      </w:pPr>
-      <w:r>
-        <w:t>S -&gt; PIPELINE | S and PIPELINE | S or PIPELINE</w:t>
-      </w:r>
+        <w:spacing w:line="230" w:lineRule="exact"/>
+      </w:pPr>
+      <w:r>
+        <w:rPr>
+          <w:rFonts w:ascii="Consolas" w:hAnsi="Consolas"/>
+          <w:sz w:val="21"/>
+        </w:rPr>
+        <w:t xml:space="preserve">  raw, compiled.cnf.trace);</w:t>
+      </w:r>
+    </w:p>
+    <w:p>
+      <w:pPr>
+        <w:keepLines/>
+      </w:pPr>
+      <w:r>
+        <w:t>Parsing checks cp path path; interpretation checks the actual workspace. Original words and token indexes connect the reconstructed tree to input occurrences, including repeated words. The interpreter uses this structure for grouping.</w:t>
+      </w:r>
+    </w:p>
+    <w:p>
+      <w:pPr>
+        <w:pStyle w:val="ReportSubtopic"/>
+        <w:keepLines/>
+      </w:pPr>
+      <w:bookmarkStart w:id="21" w:name="cmdprelude_topic_22"/>
+      <w:r>
+        <w:t>Nested command groups</w:t>
+      </w:r>
+      <w:bookmarkEnd w:id="21"/>
     </w:p>
     <w:p>
       <w:pPr>
         <w:pStyle w:val="SourceCode"/>
         <w:keepNext/>
         <w:keepLines/>
-      </w:pPr>
-      <w:r>
-        <w:t>PIPELINE -&gt; FACTOR | PIPELINE pipe FACTOR</w:t>
-      </w:r>
-    </w:p>
-    <w:p>
-      <w:pPr>
-        <w:pStyle w:val="SourceCode"/>
-        <w:keepLines/>
-      </w:pPr>
-      <w:r>
-        <w:t>FACTOR -&gt; COMMAND | lparen S rparen</w:t>
-      </w:r>
-    </w:p>
-    <w:p>
-      <w:pPr>
-        <w:keepLines/>
-        <w:spacing w:before="140"/>
-      </w:pPr>
-      <w:r>
-        <w:t>These productions are taken from the Advanced grammar. The terminals and, or, pipe, lparen and rparen represent &amp;&amp;, ||, |, ( and ) respectively. FACTOR can contain S inside parentheses, allowing a group to contain another group. The grammar also makes pipes bind more tightly than conditional chains.</w:t>
-      </w:r>
-    </w:p>
-    <w:p>
-      <w:pPr>
-        <w:pStyle w:val="ReportSubtopic"/>
-      </w:pPr>
-      <w:r>
-        <w:lastRenderedPageBreak/>
-        <w:t>Error recovery and reparsing</w:t>
-      </w:r>
-    </w:p>
-    <w:p>
-      <w:pPr>
-        <w:keepNext/>
-        <w:keepLines/>
-      </w:pPr>
-      <w:r>
-        <w:t>Source file: src/core/commandSimulator.js. suggestRepairs first creates candidates for unfinished quotes, unmatched parentheses and misplaced connectors or delimiters. The following filter removes duplicates and checks each candidate through the active grammar.</w:t>
+        <w:spacing w:line="230" w:lineRule="exact"/>
+      </w:pPr>
+      <w:r>
+        <w:rPr>
+          <w:rFonts w:ascii="Consolas" w:hAnsi="Consolas"/>
+          <w:sz w:val="21"/>
+        </w:rPr>
+        <w:t>S -&gt; PIPELINE | S and PIPELINE | S or PIPELINE</w:t>
       </w:r>
     </w:p>
     <w:p>
@@ -2292,9 +3343,14 @@
         <w:pStyle w:val="SourceCode"/>
         <w:keepNext/>
         <w:keepLines/>
-      </w:pPr>
-      <w:r>
-        <w:t>const seen = new Set();</w:t>
+        <w:spacing w:line="230" w:lineRule="exact"/>
+      </w:pPr>
+      <w:r>
+        <w:rPr>
+          <w:rFonts w:ascii="Consolas" w:hAnsi="Consolas"/>
+          <w:sz w:val="21"/>
+        </w:rPr>
+        <w:t>PIPELINE -&gt; FACTOR | PIPELINE pipe FACTOR</w:t>
       </w:r>
     </w:p>
     <w:p>
@@ -2302,9 +3358,42 @@
         <w:pStyle w:val="SourceCode"/>
         <w:keepNext/>
         <w:keepLines/>
-      </w:pPr>
-      <w:r>
-        <w:t>return candidates.filter(candidate =&gt; {</w:t>
+        <w:spacing w:line="230" w:lineRule="exact"/>
+      </w:pPr>
+      <w:r>
+        <w:rPr>
+          <w:rFonts w:ascii="Consolas" w:hAnsi="Consolas"/>
+          <w:sz w:val="21"/>
+        </w:rPr>
+        <w:t>FACTOR -&gt; COMMAND | lparen S rparen</w:t>
+      </w:r>
+    </w:p>
+    <w:p>
+      <w:pPr>
+        <w:keepLines/>
+      </w:pPr>
+      <w:r>
+        <w:t>These Advanced rules map and, or, pipe, lparen and rparen to &amp;&amp;, ||, |, ( and ). Recursion through FACTOR permits nested groups, while PIPELINE makes pipes bind more tightly than conditional chains.</w:t>
+      </w:r>
+    </w:p>
+    <w:p>
+      <w:pPr>
+        <w:pStyle w:val="ReportSubtopic"/>
+        <w:keepLines/>
+      </w:pPr>
+      <w:bookmarkStart w:id="22" w:name="cmdprelude_topic_23"/>
+      <w:r>
+        <w:t>Error recovery and reparsing</w:t>
+      </w:r>
+      <w:bookmarkEnd w:id="22"/>
+    </w:p>
+    <w:p>
+      <w:pPr>
+        <w:keepNext/>
+        <w:keepLines/>
+      </w:pPr>
+      <w:r>
+        <w:t>Source: src/core/commandSimulator.js. suggestRepairs generates candidates for unfinished quotes, unmatched parentheses and misplaced connectors. This filter removes duplicates and reparses each candidate using the active grammar.</w:t>
       </w:r>
     </w:p>
     <w:p>
@@ -2312,9 +3401,14 @@
         <w:pStyle w:val="SourceCode"/>
         <w:keepNext/>
         <w:keepLines/>
-      </w:pPr>
-      <w:r>
-        <w:t xml:space="preserve">  if (seen.has(candidate.command)) return false;</w:t>
+        <w:spacing w:line="230" w:lineRule="exact"/>
+      </w:pPr>
+      <w:r>
+        <w:rPr>
+          <w:rFonts w:ascii="Consolas" w:hAnsi="Consolas"/>
+          <w:sz w:val="21"/>
+        </w:rPr>
+        <w:t>const seen = new Set();</w:t>
       </w:r>
     </w:p>
     <w:p>
@@ -2322,9 +3416,14 @@
         <w:pStyle w:val="SourceCode"/>
         <w:keepNext/>
         <w:keepLines/>
-      </w:pPr>
-      <w:r>
-        <w:t xml:space="preserve">  seen.add(candidate.command);</w:t>
+        <w:spacing w:line="230" w:lineRule="exact"/>
+      </w:pPr>
+      <w:r>
+        <w:rPr>
+          <w:rFonts w:ascii="Consolas" w:hAnsi="Consolas"/>
+          <w:sz w:val="21"/>
+        </w:rPr>
+        <w:t>return candidates.filter(candidate =&gt; {</w:t>
       </w:r>
     </w:p>
     <w:p>
@@ -2332,9 +3431,14 @@
         <w:pStyle w:val="SourceCode"/>
         <w:keepNext/>
         <w:keepLines/>
-      </w:pPr>
-      <w:r>
-        <w:t xml:space="preserve">  const parsed = parseCommand(</w:t>
+        <w:spacing w:line="230" w:lineRule="exact"/>
+      </w:pPr>
+      <w:r>
+        <w:rPr>
+          <w:rFonts w:ascii="Consolas" w:hAnsi="Consolas"/>
+          <w:sz w:val="21"/>
+        </w:rPr>
+        <w:t xml:space="preserve">  if (seen.has(candidate.command)) return false;</w:t>
       </w:r>
     </w:p>
     <w:p>
@@ -2342,9 +3446,14 @@
         <w:pStyle w:val="SourceCode"/>
         <w:keepNext/>
         <w:keepLines/>
-      </w:pPr>
-      <w:r>
-        <w:t xml:space="preserve">    candidate.command, false, grammarText);</w:t>
+        <w:spacing w:line="230" w:lineRule="exact"/>
+      </w:pPr>
+      <w:r>
+        <w:rPr>
+          <w:rFonts w:ascii="Consolas" w:hAnsi="Consolas"/>
+          <w:sz w:val="21"/>
+        </w:rPr>
+        <w:t xml:space="preserve">  seen.add(candidate.command);</w:t>
       </w:r>
     </w:p>
     <w:p>
@@ -2352,52 +3461,14 @@
         <w:pStyle w:val="SourceCode"/>
         <w:keepNext/>
         <w:keepLines/>
-      </w:pPr>
-      <w:r>
-        <w:t xml:space="preserve">  return parsed.accepted &amp;&amp; !parsed.interpretationError;</w:t>
-      </w:r>
-    </w:p>
-    <w:p>
-      <w:pPr>
-        <w:pStyle w:val="SourceCode"/>
-        <w:keepLines/>
-      </w:pPr>
-      <w:r>
-        <w:t>}).slice(0, 3);</w:t>
-      </w:r>
-    </w:p>
-    <w:p>
-      <w:pPr>
-        <w:keepLines/>
-        <w:spacing w:before="140"/>
-      </w:pPr>
-      <w:r>
-        <w:t>A candidate is offered only when parsing succeeds and the interpreter can derive a supported, unambiguous structure. Up to three candidates are returned. This checks the proposed syntax, not the existence of files or the success of the eventual operation. Reference [2] describes related error-correcting parsing research; the project does not implement its full minimum-distance algorithm.</w:t>
-      </w:r>
-    </w:p>
-    <w:p>
-      <w:pPr>
-        <w:keepLines/>
-      </w:pPr>
-      <w:r>
-        <w:t>The user selects a correction explicitly. The interface retains the rejected input and displays the reparse result. A candidate valid under Advanced mode may be rejected by a more restricted preset because corrections use the grammar currently selected.</w:t>
-      </w:r>
-    </w:p>
-    <w:p>
-      <w:pPr>
-        <w:pStyle w:val="ReportSubtopic"/>
-      </w:pPr>
-      <w:r>
-        <w:t>Simulation API</w:t>
-      </w:r>
-    </w:p>
-    <w:p>
-      <w:pPr>
-        <w:keepNext/>
-        <w:keepLines/>
-      </w:pPr>
-      <w:r>
-        <w:t>Source file: src/server.js. This endpoint receives the command, workspace, watched paths and selected grammar. It calls simulateCommand and returns the result as JSON. Only line wrapping has been changed below for readability.</w:t>
+        <w:spacing w:line="230" w:lineRule="exact"/>
+      </w:pPr>
+      <w:r>
+        <w:rPr>
+          <w:rFonts w:ascii="Consolas" w:hAnsi="Consolas"/>
+          <w:sz w:val="21"/>
+        </w:rPr>
+        <w:t xml:space="preserve">  const parsed = parseCommand(</w:t>
       </w:r>
     </w:p>
     <w:p>
@@ -2405,9 +3476,14 @@
         <w:pStyle w:val="SourceCode"/>
         <w:keepNext/>
         <w:keepLines/>
-      </w:pPr>
-      <w:r>
-        <w:t>app.post('/api/simulate', (req, res) =&gt; {</w:t>
+        <w:spacing w:line="230" w:lineRule="exact"/>
+      </w:pPr>
+      <w:r>
+        <w:rPr>
+          <w:rFonts w:ascii="Consolas" w:hAnsi="Consolas"/>
+          <w:sz w:val="21"/>
+        </w:rPr>
+        <w:t xml:space="preserve">    candidate.command, false, grammarText);</w:t>
       </w:r>
     </w:p>
     <w:p>
@@ -2415,9 +3491,14 @@
         <w:pStyle w:val="SourceCode"/>
         <w:keepNext/>
         <w:keepLines/>
-      </w:pPr>
-      <w:r>
-        <w:t xml:space="preserve">  try {</w:t>
+        <w:spacing w:line="230" w:lineRule="exact"/>
+      </w:pPr>
+      <w:r>
+        <w:rPr>
+          <w:rFonts w:ascii="Consolas" w:hAnsi="Consolas"/>
+          <w:sz w:val="21"/>
+        </w:rPr>
+        <w:t xml:space="preserve">  return parsed.accepted &amp;&amp; !parsed.interpretationError;</w:t>
       </w:r>
     </w:p>
     <w:p>
@@ -2425,11 +3506,153 @@
         <w:pStyle w:val="SourceCode"/>
         <w:keepNext/>
         <w:keepLines/>
-      </w:pPr>
-      <w:r>
+        <w:spacing w:line="230" w:lineRule="exact"/>
+      </w:pPr>
+      <w:r>
+        <w:rPr>
+          <w:rFonts w:ascii="Consolas" w:hAnsi="Consolas"/>
+          <w:sz w:val="21"/>
+        </w:rPr>
+        <w:t>}).slice(0, 3);</w:t>
+      </w:r>
+    </w:p>
+    <w:p>
+      <w:pPr>
+        <w:keepLines/>
+      </w:pPr>
+      <w:r>
+        <w:t>Up to three supported, unambiguous candidates are offered for explicit selection and re-preview. They validate syntax, not file existence. Reference [2] provides related background; the project does not implement its complete minimum-distance algorithm.</w:t>
+      </w:r>
+    </w:p>
+    <w:p>
+      <w:pPr>
+        <w:pStyle w:val="ReportSubtopic"/>
+        <w:keepLines/>
+      </w:pPr>
+      <w:bookmarkStart w:id="23" w:name="cmdprelude_snapshot"/>
+      <w:r>
+        <w:t>Workspace snapshot and change detection</w:t>
+      </w:r>
+      <w:bookmarkEnd w:id="23"/>
+    </w:p>
+    <w:p>
+      <w:pPr>
+        <w:keepNext/>
+        <w:keepLines/>
+      </w:pPr>
+      <w:r>
+        <w:t>Source: src/core/commandSimulator.js. These selected statements clone the snapshot and calculate the final differences. Command evaluation and rebuilding state.entries occur between setup and comparison.</w:t>
+      </w:r>
+    </w:p>
+    <w:p>
+      <w:pPr>
+        <w:pStyle w:val="SourceCode"/>
+        <w:keepNext/>
+        <w:keepLines/>
+        <w:spacing w:line="230" w:lineRule="exact"/>
+      </w:pPr>
+      <w:r>
+        <w:rPr>
+          <w:rFonts w:ascii="Consolas" w:hAnsi="Consolas"/>
+          <w:sz w:val="21"/>
+        </w:rPr>
+        <w:t>const state = structuredClone(before);</w:t>
+      </w:r>
+      <w:r>
+        <w:rPr>
+          <w:rFonts w:ascii="Consolas" w:hAnsi="Consolas"/>
+          <w:sz w:val="21"/>
+        </w:rPr>
+        <w:br/>
+        <w:t>let fs = new Map(state.entries.map(entry =&gt; [entry.path, entry]));</w:t>
+      </w:r>
+      <w:r>
+        <w:rPr>
+          <w:rFonts w:ascii="Consolas" w:hAnsi="Consolas"/>
+          <w:sz w:val="21"/>
+        </w:rPr>
+        <w:br/>
+        <w:t>const changes = diffWorkspaces(before, state);</w:t>
+      </w:r>
+    </w:p>
+    <w:p>
+      <w:pPr>
+        <w:keepLines/>
+      </w:pPr>
+      <w:r>
+        <w:t>Comparison identifies created, deleted and modified paths. Trace entries also record each step’s output, exit status and changes, so previews can explain their results.</w:t>
+      </w:r>
+    </w:p>
+    <w:p>
+      <w:pPr>
+        <w:pStyle w:val="ReportSubtopic"/>
+        <w:keepLines/>
+      </w:pPr>
+      <w:bookmarkStart w:id="24" w:name="cmdprelude_topic_24"/>
+      <w:r>
+        <w:lastRenderedPageBreak/>
+        <w:t>Simulation API</w:t>
+      </w:r>
+      <w:bookmarkEnd w:id="24"/>
+    </w:p>
+    <w:p>
+      <w:pPr>
+        <w:keepNext/>
+        <w:keepLines/>
+      </w:pPr>
+      <w:r>
+        <w:t>Source: src/server.js. This endpoint passes the command, workspace, watched paths and selected grammar to simulateCommand, then returns JSON. Line wrapping is adjusted for readability.</w:t>
+      </w:r>
+    </w:p>
+    <w:p>
+      <w:pPr>
+        <w:pStyle w:val="SourceCode"/>
+        <w:keepNext/>
+        <w:keepLines/>
+        <w:spacing w:line="230" w:lineRule="exact"/>
+      </w:pPr>
+      <w:r>
+        <w:rPr>
+          <w:rFonts w:ascii="Consolas" w:hAnsi="Consolas"/>
+          <w:sz w:val="21"/>
+        </w:rPr>
+        <w:t>app.post('/api/simulate', (req, res) =&gt; {</w:t>
+      </w:r>
+    </w:p>
+    <w:p>
+      <w:pPr>
+        <w:pStyle w:val="SourceCode"/>
+        <w:keepNext/>
+        <w:keepLines/>
+        <w:spacing w:line="230" w:lineRule="exact"/>
+      </w:pPr>
+      <w:r>
+        <w:rPr>
+          <w:rFonts w:ascii="Consolas" w:hAnsi="Consolas"/>
+          <w:sz w:val="21"/>
+        </w:rPr>
+        <w:t xml:space="preserve">  try {</w:t>
+      </w:r>
+    </w:p>
+    <w:p>
+      <w:pPr>
+        <w:pStyle w:val="SourceCode"/>
+        <w:keepNext/>
+        <w:keepLines/>
+        <w:spacing w:line="230" w:lineRule="exact"/>
+      </w:pPr>
+      <w:r>
+        <w:rPr>
+          <w:rFonts w:ascii="Consolas" w:hAnsi="Consolas"/>
+          <w:sz w:val="21"/>
+        </w:rPr>
         <w:t xml:space="preserve">    const { command, workspace,</w:t>
       </w:r>
       <w:r>
+        <w:rPr>
+          <w:rFonts w:ascii="Consolas" w:hAnsi="Consolas"/>
+          <w:sz w:val="21"/>
+        </w:rPr>
         <w:br/>
         <w:t xml:space="preserve">      protectedPaths, grammarText } =</w:t>
       </w:r>
@@ -2439,8 +3662,13 @@
         <w:pStyle w:val="SourceCode"/>
         <w:keepNext/>
         <w:keepLines/>
-      </w:pPr>
-      <w:r>
+        <w:spacing w:line="230" w:lineRule="exact"/>
+      </w:pPr>
+      <w:r>
+        <w:rPr>
+          <w:rFonts w:ascii="Consolas" w:hAnsi="Consolas"/>
+          <w:sz w:val="21"/>
+        </w:rPr>
         <w:t xml:space="preserve">      req.body || {};</w:t>
       </w:r>
     </w:p>
@@ -2449,8 +3677,13 @@
         <w:pStyle w:val="SourceCode"/>
         <w:keepNext/>
         <w:keepLines/>
-      </w:pPr>
-      <w:r>
+        <w:spacing w:line="230" w:lineRule="exact"/>
+      </w:pPr>
+      <w:r>
+        <w:rPr>
+          <w:rFonts w:ascii="Consolas" w:hAnsi="Consolas"/>
+          <w:sz w:val="21"/>
+        </w:rPr>
         <w:t xml:space="preserve">    const result = simulateCommand(</w:t>
       </w:r>
     </w:p>
@@ -2459,8 +3692,13 @@
         <w:pStyle w:val="SourceCode"/>
         <w:keepNext/>
         <w:keepLines/>
-      </w:pPr>
-      <w:r>
+        <w:spacing w:line="230" w:lineRule="exact"/>
+      </w:pPr>
+      <w:r>
+        <w:rPr>
+          <w:rFonts w:ascii="Consolas" w:hAnsi="Consolas"/>
+          <w:sz w:val="21"/>
+        </w:rPr>
         <w:t xml:space="preserve">      command, workspace, protectedPaths, grammarText);</w:t>
       </w:r>
     </w:p>
@@ -2469,8 +3707,13 @@
         <w:pStyle w:val="SourceCode"/>
         <w:keepNext/>
         <w:keepLines/>
-      </w:pPr>
-      <w:r>
+        <w:spacing w:line="230" w:lineRule="exact"/>
+      </w:pPr>
+      <w:r>
+        <w:rPr>
+          <w:rFonts w:ascii="Consolas" w:hAnsi="Consolas"/>
+          <w:sz w:val="21"/>
+        </w:rPr>
         <w:t xml:space="preserve">    res.json(result);</w:t>
       </w:r>
     </w:p>
@@ -2479,8 +3722,13 @@
         <w:pStyle w:val="SourceCode"/>
         <w:keepNext/>
         <w:keepLines/>
-      </w:pPr>
-      <w:r>
+        <w:spacing w:line="230" w:lineRule="exact"/>
+      </w:pPr>
+      <w:r>
+        <w:rPr>
+          <w:rFonts w:ascii="Consolas" w:hAnsi="Consolas"/>
+          <w:sz w:val="21"/>
+        </w:rPr>
         <w:t xml:space="preserve">  } catch (error) {</w:t>
       </w:r>
     </w:p>
@@ -2489,23 +3737,44 @@
         <w:pStyle w:val="SourceCode"/>
         <w:keepNext/>
         <w:keepLines/>
-      </w:pPr>
-      <w:r>
+        <w:spacing w:line="230" w:lineRule="exact"/>
+      </w:pPr>
+      <w:r>
+        <w:rPr>
+          <w:rFonts w:ascii="Consolas" w:hAnsi="Consolas"/>
+          <w:sz w:val="21"/>
+        </w:rPr>
         <w:t xml:space="preserve">    res.status(400).json({</w:t>
       </w:r>
       <w:r>
+        <w:rPr>
+          <w:rFonts w:ascii="Consolas" w:hAnsi="Consolas"/>
+          <w:sz w:val="21"/>
+        </w:rPr>
         <w:br/>
         <w:t xml:space="preserve">      accepted: false,</w:t>
       </w:r>
       <w:r>
+        <w:rPr>
+          <w:rFonts w:ascii="Consolas" w:hAnsi="Consolas"/>
+          <w:sz w:val="21"/>
+        </w:rPr>
         <w:br/>
         <w:t xml:space="preserve">      error: error.message,</w:t>
       </w:r>
       <w:r>
+        <w:rPr>
+          <w:rFonts w:ascii="Consolas" w:hAnsi="Consolas"/>
+          <w:sz w:val="21"/>
+        </w:rPr>
         <w:br/>
         <w:t xml:space="preserve">      repairs: []</w:t>
       </w:r>
       <w:r>
+        <w:rPr>
+          <w:rFonts w:ascii="Consolas" w:hAnsi="Consolas"/>
+          <w:sz w:val="21"/>
+        </w:rPr>
         <w:br/>
         <w:t xml:space="preserve">    });</w:t>
       </w:r>
@@ -2515,44 +3784,57 @@
         <w:pStyle w:val="SourceCode"/>
         <w:keepNext/>
         <w:keepLines/>
-      </w:pPr>
-      <w:r>
+        <w:spacing w:line="230" w:lineRule="exact"/>
+      </w:pPr>
+      <w:r>
+        <w:rPr>
+          <w:rFonts w:ascii="Consolas" w:hAnsi="Consolas"/>
+          <w:sz w:val="21"/>
+        </w:rPr>
         <w:t xml:space="preserve">  }</w:t>
       </w:r>
     </w:p>
     <w:p>
       <w:pPr>
         <w:pStyle w:val="SourceCode"/>
-        <w:keepLines/>
-      </w:pPr>
-      <w:r>
+        <w:keepNext/>
+        <w:keepLines/>
+        <w:spacing w:line="230" w:lineRule="exact"/>
+      </w:pPr>
+      <w:r>
+        <w:rPr>
+          <w:rFonts w:ascii="Consolas" w:hAnsi="Consolas"/>
+          <w:sz w:val="21"/>
+        </w:rPr>
         <w:t>});</w:t>
       </w:r>
     </w:p>
     <w:p>
       <w:pPr>
         <w:keepLines/>
-        <w:spacing w:before="140"/>
-      </w:pPr>
-      <w:r>
-        <w:lastRenderedPageBreak/>
-        <w:t>The returned simulation result can include parsing information, output, errors, an execution trace and before-and-after workspace states. Most expected input failures are returned as structured results by the analysis functions. The catch block handles thrown errors with HTTP status 400. Separate local-folder endpoints handle opening, previewing and applying reviewed operations.</w:t>
+      </w:pPr>
+      <w:r>
+        <w:t>The result includes analysis, output, errors, execution trace and workspace states. Expected input failures are structured results; thrown errors return HTTP 400. Separate local-folder endpoints handle reviewed changes.</w:t>
       </w:r>
     </w:p>
     <w:p>
       <w:pPr>
         <w:pStyle w:val="ReportSubtopic"/>
-      </w:pPr>
+        <w:keepLines/>
+      </w:pPr>
+      <w:bookmarkStart w:id="25" w:name="cmdprelude_topic_25"/>
       <w:r>
         <w:t>Testing and demonstration cases</w:t>
       </w:r>
-    </w:p>
-    <w:p>
-      <w:pPr>
-        <w:keepLines/>
-      </w:pPr>
-      <w:r>
-        <w:t>The project includes automated tests for grammar processing, command simulation and reviewed local-folder operations. The examples below describe expected behaviour for a manual demonstration. Select Advanced mode for echo, connectors and parenthesised groups; use the default sample workspace for the copy examples.</w:t>
+      <w:bookmarkEnd w:id="25"/>
+    </w:p>
+    <w:p>
+      <w:pPr>
+        <w:keepNext/>
+        <w:keepLines/>
+      </w:pPr>
+      <w:r>
+        <w:t>Automated checks cover the grammar pipeline, simulation and local-folder operations. Use Advanced mode for quotes, connectors and groups; use the sample workspace for the copy examples below.</w:t>
       </w:r>
     </w:p>
     <w:tbl>
@@ -2593,7 +3875,8 @@
           <w:p>
             <w:pPr>
               <w:keepNext/>
-              <w:spacing w:after="40" w:line="264" w:lineRule="auto"/>
+              <w:keepLines/>
+              <w:spacing w:after="60"/>
             </w:pPr>
             <w:r>
               <w:rPr>
@@ -2624,7 +3907,8 @@
           <w:p>
             <w:pPr>
               <w:keepNext/>
-              <w:spacing w:after="40" w:line="264" w:lineRule="auto"/>
+              <w:keepLines/>
+              <w:spacing w:after="60"/>
             </w:pPr>
             <w:r>
               <w:rPr>
@@ -2660,7 +3944,8 @@
           <w:p>
             <w:pPr>
               <w:keepNext/>
-              <w:spacing w:after="40" w:line="264" w:lineRule="auto"/>
+              <w:keepLines/>
+              <w:spacing w:after="60"/>
             </w:pPr>
             <w:r>
               <w:t>cp notes.txt backup/</w:t>
@@ -2687,7 +3972,8 @@
           <w:p>
             <w:pPr>
               <w:keepNext/>
-              <w:spacing w:after="40" w:line="264" w:lineRule="auto"/>
+              <w:keepLines/>
+              <w:spacing w:after="60"/>
             </w:pPr>
             <w:r>
               <w:t>Previews a copy when the sample source and destination exist.</w:t>
@@ -2720,7 +4006,8 @@
           <w:p>
             <w:pPr>
               <w:keepNext/>
-              <w:spacing w:after="40" w:line="264" w:lineRule="auto"/>
+              <w:keepLines/>
+              <w:spacing w:after="60"/>
             </w:pPr>
             <w:r>
               <w:t>cp notes.txt backup/ &amp;&amp;</w:t>
@@ -2747,7 +4034,8 @@
           <w:p>
             <w:pPr>
               <w:keepNext/>
-              <w:spacing w:after="40" w:line="264" w:lineRule="auto"/>
+              <w:keepLines/>
+              <w:spacing w:after="60"/>
             </w:pPr>
             <w:r>
               <w:t>Rejects the unfinished chain; can offer removal of &amp;&amp;.</w:t>
@@ -2780,7 +4068,8 @@
           <w:p>
             <w:pPr>
               <w:keepNext/>
-              <w:spacing w:after="40" w:line="264" w:lineRule="auto"/>
+              <w:keepLines/>
+              <w:spacing w:after="60"/>
             </w:pPr>
             <w:r>
               <w:t>echo "hello</w:t>
@@ -2807,7 +4096,8 @@
           <w:p>
             <w:pPr>
               <w:keepNext/>
-              <w:spacing w:after="40" w:line="264" w:lineRule="auto"/>
+              <w:keepLines/>
+              <w:spacing w:after="60"/>
             </w:pPr>
             <w:r>
               <w:t>Reports the unfinished quote; can offer echo "hello".</w:t>
@@ -2840,7 +4130,8 @@
           <w:p>
             <w:pPr>
               <w:keepNext/>
-              <w:spacing w:after="40" w:line="264" w:lineRule="auto"/>
+              <w:keepLines/>
+              <w:spacing w:after="60"/>
             </w:pPr>
             <w:r>
               <w:t>(pwd</w:t>
@@ -2867,7 +4158,8 @@
           <w:p>
             <w:pPr>
               <w:keepNext/>
-              <w:spacing w:after="40" w:line="264" w:lineRule="auto"/>
+              <w:keepLines/>
+              <w:spacing w:after="60"/>
             </w:pPr>
             <w:r>
               <w:t>Reports the unmatched group; can offer (pwd).</w:t>
@@ -2900,7 +4192,8 @@
           <w:p>
             <w:pPr>
               <w:keepNext/>
-              <w:spacing w:after="40" w:line="264" w:lineRule="auto"/>
+              <w:keepLines/>
+              <w:spacing w:after="60"/>
             </w:pPr>
             <w:r>
               <w:t>cp notes.txt</w:t>
@@ -2927,7 +4220,8 @@
           <w:p>
             <w:pPr>
               <w:keepNext/>
-              <w:spacing w:after="40" w:line="264" w:lineRule="auto"/>
+              <w:keepLines/>
+              <w:spacing w:after="60"/>
             </w:pPr>
             <w:r>
               <w:t>Rejects the missing destination and asks for a path.</w:t>
@@ -2959,7 +4253,8 @@
           </w:tcPr>
           <w:p>
             <w:pPr>
-              <w:spacing w:after="40" w:line="264" w:lineRule="auto"/>
+              <w:keepLines/>
+              <w:spacing w:after="60"/>
             </w:pPr>
             <w:r>
               <w:t>Modify a real folder after preview</w:t>
@@ -2985,7 +4280,8 @@
           </w:tcPr>
           <w:p>
             <w:pPr>
-              <w:spacing w:after="40" w:line="264" w:lineRule="auto"/>
+              <w:keepLines/>
+              <w:spacing w:after="60"/>
             </w:pPr>
             <w:r>
               <w:t>Invalidates the old plan and requires a new preview.</w:t>
@@ -2999,23 +4295,25 @@
         <w:keepLines/>
       </w:pPr>
       <w:r>
-        <w:t>These examples distinguish successful previews, syntax errors that may be corrected, and accepted commands that fail a workspace check. Separate test suites cover the grammar pipeline, simulator and reviewed file operations.</w:t>
+        <w:t>These cases distinguish successful previews, recoverable syntax errors and valid commands that fail workspace checks. Local-folder tests also check for changes made after a preview.</w:t>
       </w:r>
     </w:p>
     <w:p>
       <w:pPr>
         <w:pStyle w:val="ReportTopic"/>
+        <w:keepLines/>
         <w:pageBreakBefore/>
       </w:pPr>
+      <w:bookmarkStart w:id="26" w:name="cmdprelude_topic_26"/>
       <w:r>
         <w:lastRenderedPageBreak/>
         <w:t>Screenshot of the errors segments</w:t>
       </w:r>
-    </w:p>
-    <w:p>
-      <w:pPr>
-        <w:keepLines/>
-        <w:spacing w:after="160"/>
+      <w:bookmarkEnd w:id="26"/>
+    </w:p>
+    <w:p>
+      <w:pPr>
+        <w:keepLines/>
       </w:pPr>
       <w:r>
         <w:t>A directory-isolation error in commandSimulator.js caused commands outside a parenthesised group to use the wrong working directory. The group changed the shared current directory, but the interpreter did not restore the caller’s directory when the group finished.</w:t>
@@ -3024,7 +4322,6 @@
     <w:p>
       <w:pPr>
         <w:keepLines/>
-        <w:spacing w:after="160"/>
       </w:pPr>
       <w:r>
         <w:t>For the valid command (cd src &amp;&amp; pwd) &amp;&amp; pwd, the first pwd should print /src and the second should print /. The faulty interpreter printed /src twice. Parsing succeeded and the command returned exit status 0, so the incorrect behaviour had to be detected by checking the result against its expected meaning.</w:t>
@@ -3034,7 +4331,7 @@
       <w:pPr>
         <w:keepNext/>
         <w:keepLines/>
-        <w:spacing w:after="160"/>
+        <w:spacing w:after="60"/>
         <w:jc w:val="center"/>
       </w:pPr>
       <w:r>
@@ -3042,8 +4339,8 @@
           <w:noProof/>
         </w:rPr>
         <w:drawing>
-          <wp:inline distT="0" distB="0" distL="0" distR="0" wp14:anchorId="43A36FAA" wp14:editId="6FFF9882">
-            <wp:extent cx="5897880" cy="2621280"/>
+          <wp:inline distT="0" distB="0" distL="0" distR="0" wp14:anchorId="5F5CE0D8" wp14:editId="092AB250">
+            <wp:extent cx="5806440" cy="2580640"/>
             <wp:effectExtent l="0" t="0" r="0" b="0"/>
             <wp:docPr id="1" name="Picture 1" descr="Cropped actual Node.js regression output showing four failed checks and an expected-versus-actual assertion"/>
             <wp:cNvGraphicFramePr>
@@ -3057,7 +4354,7 @@
                     <pic:cNvPicPr/>
                   </pic:nvPicPr>
                   <pic:blipFill>
-                    <a:blip r:embed="rId9"/>
+                    <a:blip r:embed="rId10"/>
                     <a:stretch>
                       <a:fillRect/>
                     </a:stretch>
@@ -3065,7 +4362,7 @@
                   <pic:spPr>
                     <a:xfrm>
                       <a:off x="0" y="0"/>
-                      <a:ext cx="5897880" cy="2621280"/>
+                      <a:ext cx="5806440" cy="2580640"/>
                     </a:xfrm>
                     <a:prstGeom prst="rect">
                       <a:avLst/>
@@ -3081,7 +4378,7 @@
     <w:p>
       <w:pPr>
         <w:keepLines/>
-        <w:spacing w:after="160"/>
+        <w:spacing w:after="100"/>
         <w:jc w:val="center"/>
       </w:pPr>
       <w:r>
@@ -3094,16 +4391,17 @@
     </w:p>
     <w:p>
       <w:pPr>
+        <w:keepLines/>
+      </w:pPr>
+      <w:r>
+        <w:t>The website showed the same error in its Virtual output panel. For (cd src &amp;&amp; pwd) &amp;&amp; pwd, both lines displayed /src, although the second command was outside the group. The exit status was still 0, so the problem was visible in the output rather than as an error warning.</w:t>
+      </w:r>
+    </w:p>
+    <w:p>
+      <w:pPr>
         <w:keepNext/>
-      </w:pPr>
-      <w:r>
-        <w:t>The website showed the same error in its Virtual output panel. For (cd src &amp;&amp; pwd) &amp;&amp; pwd, both lines displayed /src, although the second command was outside the group. The exit status was still 0, so the problem was visible in the output rather than as an error warning.</w:t>
-      </w:r>
-    </w:p>
-    <w:p>
-      <w:pPr>
-        <w:keepNext/>
-        <w:spacing w:after="100"/>
+        <w:keepLines/>
+        <w:spacing w:after="60"/>
         <w:jc w:val="center"/>
       </w:pPr>
       <w:r>
@@ -3111,8 +4409,8 @@
           <w:noProof/>
         </w:rPr>
         <w:drawing>
-          <wp:inline distT="0" distB="0" distL="0" distR="0" wp14:anchorId="3B8AA591" wp14:editId="50FE8CB5">
-            <wp:extent cx="5897880" cy="939825"/>
+          <wp:inline distT="0" distB="0" distL="0" distR="0" wp14:anchorId="4607537F" wp14:editId="221AFDF7">
+            <wp:extent cx="5806440" cy="925254"/>
             <wp:effectExtent l="0" t="0" r="0" b="0"/>
             <wp:docPr id="3" name="Picture 3" descr="Website before the fix. The second directory output is incorrectly /src."/>
             <wp:cNvGraphicFramePr>
@@ -3126,7 +4424,7 @@
                     <pic:cNvPicPr/>
                   </pic:nvPicPr>
                   <pic:blipFill>
-                    <a:blip r:embed="rId10"/>
+                    <a:blip r:embed="rId11"/>
                     <a:stretch>
                       <a:fillRect/>
                     </a:stretch>
@@ -3134,7 +4432,7 @@
                   <pic:spPr>
                     <a:xfrm>
                       <a:off x="0" y="0"/>
-                      <a:ext cx="5897880" cy="939825"/>
+                      <a:ext cx="5806440" cy="925254"/>
                     </a:xfrm>
                     <a:prstGeom prst="rect">
                       <a:avLst/>
@@ -3149,7 +4447,8 @@
     </w:p>
     <w:p>
       <w:pPr>
-        <w:spacing w:after="160"/>
+        <w:keepLines/>
+        <w:spacing w:after="100"/>
         <w:jc w:val="center"/>
       </w:pPr>
       <w:r>
@@ -3163,7 +4462,6 @@
     <w:p>
       <w:pPr>
         <w:keepLines/>
-        <w:spacing w:after="160"/>
       </w:pPr>
       <w:r>
         <w:t>The cropped screenshot shows actual automated test output. The assertion reports the unexpected /src result outside the group. Four of five checks failed, covering ordinary groups, nested groups, file-changing groups and a group followed by a fallback command. This identified a state-management problem in interpretation rather than an error in the grammar or CYK parser.</w:t>
@@ -3172,17 +4470,19 @@
     <w:p>
       <w:pPr>
         <w:pStyle w:val="ReportTopic"/>
+        <w:keepLines/>
         <w:pageBreakBefore/>
       </w:pPr>
+      <w:bookmarkStart w:id="27" w:name="cmdprelude_topic_27"/>
       <w:r>
         <w:lastRenderedPageBreak/>
         <w:t>Screenshot of the error recovered segments</w:t>
       </w:r>
-    </w:p>
-    <w:p>
-      <w:pPr>
-        <w:keepLines/>
-        <w:spacing w:after="160"/>
+      <w:bookmarkEnd w:id="27"/>
+    </w:p>
+    <w:p>
+      <w:pPr>
+        <w:keepLines/>
       </w:pPr>
       <w:r>
         <w:t>The correction saves the caller’s current directory before evaluating a group and restores it in a finally block. Each nested group therefore restores its own caller’s directory. Only the directory is restored; the group’s output and intended virtual file changes are preserved.</w:t>
@@ -3192,24 +4492,44 @@
       <w:pPr>
         <w:pStyle w:val="SourceCode"/>
         <w:keepLines/>
-        <w:spacing w:after="160"/>
-      </w:pPr>
-      <w:r>
+        <w:spacing w:line="230" w:lineRule="exact"/>
+      </w:pPr>
+      <w:r>
+        <w:rPr>
+          <w:rFonts w:ascii="Consolas" w:hAnsi="Consolas"/>
+          <w:sz w:val="21"/>
+        </w:rPr>
         <w:t>if (node.type === 'group') {</w:t>
       </w:r>
       <w:r>
+        <w:rPr>
+          <w:rFonts w:ascii="Consolas" w:hAnsi="Consolas"/>
+          <w:sz w:val="21"/>
+        </w:rPr>
         <w:br/>
         <w:t xml:space="preserve">  const savedCwd = state.cwd;</w:t>
       </w:r>
       <w:r>
+        <w:rPr>
+          <w:rFonts w:ascii="Consolas" w:hAnsi="Consolas"/>
+          <w:sz w:val="21"/>
+        </w:rPr>
         <w:br/>
         <w:t xml:space="preserve">  try { return evaluate(node.body, stdin, inPipe); }</w:t>
       </w:r>
       <w:r>
+        <w:rPr>
+          <w:rFonts w:ascii="Consolas" w:hAnsi="Consolas"/>
+          <w:sz w:val="21"/>
+        </w:rPr>
         <w:br/>
         <w:t xml:space="preserve">  finally { state.cwd = savedCwd; }</w:t>
       </w:r>
       <w:r>
+        <w:rPr>
+          <w:rFonts w:ascii="Consolas" w:hAnsi="Consolas"/>
+          <w:sz w:val="21"/>
+        </w:rPr>
         <w:br/>
         <w:t>}</w:t>
       </w:r>
@@ -3217,7 +4537,6 @@
     <w:p>
       <w:pPr>
         <w:keepLines/>
-        <w:spacing w:after="160"/>
       </w:pPr>
       <w:r>
         <w:t>After this correction, (cd src &amp;&amp; pwd) &amp;&amp; pwd prints /src followed by /, and the final current directory remains /. The same test cases were run again against the corrected interpreter.</w:t>
@@ -3227,7 +4546,7 @@
       <w:pPr>
         <w:keepNext/>
         <w:keepLines/>
-        <w:spacing w:after="160"/>
+        <w:spacing w:after="60"/>
         <w:jc w:val="center"/>
       </w:pPr>
       <w:r>
@@ -3235,8 +4554,8 @@
           <w:noProof/>
         </w:rPr>
         <w:drawing>
-          <wp:inline distT="0" distB="0" distL="0" distR="0" wp14:anchorId="5068DE36" wp14:editId="62218B04">
-            <wp:extent cx="5897880" cy="1572768"/>
+          <wp:inline distT="0" distB="0" distL="0" distR="0" wp14:anchorId="008DA382" wp14:editId="54C65D3C">
+            <wp:extent cx="5806440" cy="1548384"/>
             <wp:effectExtent l="0" t="0" r="0" b="0"/>
             <wp:docPr id="2" name="Picture 2" descr="Cropped actual Node.js regression output showing all five group isolation checks passing"/>
             <wp:cNvGraphicFramePr>
@@ -3250,7 +4569,7 @@
                     <pic:cNvPicPr/>
                   </pic:nvPicPr>
                   <pic:blipFill>
-                    <a:blip r:embed="rId11"/>
+                    <a:blip r:embed="rId12"/>
                     <a:stretch>
                       <a:fillRect/>
                     </a:stretch>
@@ -3258,7 +4577,7 @@
                   <pic:spPr>
                     <a:xfrm>
                       <a:off x="0" y="0"/>
-                      <a:ext cx="5897880" cy="1572768"/>
+                      <a:ext cx="5806440" cy="1548384"/>
                     </a:xfrm>
                     <a:prstGeom prst="rect">
                       <a:avLst/>
@@ -3274,7 +4593,7 @@
     <w:p>
       <w:pPr>
         <w:keepLines/>
-        <w:spacing w:after="160"/>
+        <w:spacing w:after="100"/>
         <w:jc w:val="center"/>
       </w:pPr>
       <w:r>
@@ -3287,16 +4606,17 @@
     </w:p>
     <w:p>
       <w:pPr>
+        <w:keepLines/>
+      </w:pPr>
+      <w:r>
+        <w:t>After the fix, the same command produces /src on the first line and / on the second line in the website. The outer command now runs from the original directory. The interface layout stays the same; the change is in the interpreter result displayed to the user.</w:t>
+      </w:r>
+    </w:p>
+    <w:p>
+      <w:pPr>
         <w:keepNext/>
-      </w:pPr>
-      <w:r>
-        <w:t>After the fix, the same command produces /src on the first line and / on the second line in the website. The outer command now runs from the original directory. The interface layout stays the same; the change is in the interpreter result displayed to the user.</w:t>
-      </w:r>
-    </w:p>
-    <w:p>
-      <w:pPr>
-        <w:keepNext/>
-        <w:spacing w:after="100"/>
+        <w:keepLines/>
+        <w:spacing w:after="60"/>
         <w:jc w:val="center"/>
       </w:pPr>
       <w:r>
@@ -3304,8 +4624,8 @@
           <w:noProof/>
         </w:rPr>
         <w:drawing>
-          <wp:inline distT="0" distB="0" distL="0" distR="0" wp14:anchorId="3BDF0AA5" wp14:editId="76A82EE2">
-            <wp:extent cx="5897880" cy="939825"/>
+          <wp:inline distT="0" distB="0" distL="0" distR="0" wp14:anchorId="58F3AAAD" wp14:editId="16E79906">
+            <wp:extent cx="5806440" cy="925254"/>
             <wp:effectExtent l="0" t="0" r="0" b="0"/>
             <wp:docPr id="4" name="Picture 4" descr="Website after the fix. The second directory output is correctly /."/>
             <wp:cNvGraphicFramePr>
@@ -3319,7 +4639,7 @@
                     <pic:cNvPicPr/>
                   </pic:nvPicPr>
                   <pic:blipFill>
-                    <a:blip r:embed="rId12"/>
+                    <a:blip r:embed="rId13"/>
                     <a:stretch>
                       <a:fillRect/>
                     </a:stretch>
@@ -3327,7 +4647,7 @@
                   <pic:spPr>
                     <a:xfrm>
                       <a:off x="0" y="0"/>
-                      <a:ext cx="5897880" cy="939825"/>
+                      <a:ext cx="5806440" cy="925254"/>
                     </a:xfrm>
                     <a:prstGeom prst="rect">
                       <a:avLst/>
@@ -3342,7 +4662,8 @@
     </w:p>
     <w:p>
       <w:pPr>
-        <w:spacing w:after="160"/>
+        <w:keepLines/>
+        <w:spacing w:after="100"/>
         <w:jc w:val="center"/>
       </w:pPr>
       <w:r>
@@ -3356,7 +4677,6 @@
     <w:p>
       <w:pPr>
         <w:keepLines/>
-        <w:spacing w:after="160"/>
       </w:pPr>
       <w:r>
         <w:t>The checks cover directory restoration, nested groups, preservation of virtual file changes, recovery after a failing group and output through a pipeline. All five targeted checks and all 32 existing simulator checks passed, giving 37 passes and no failures.</w:t>
@@ -3364,17 +4684,29 @@
     </w:p>
     <w:p>
       <w:pPr>
+        <w:keepLines/>
+      </w:pPr>
+      <w:r>
+        <w:t>Restoring only the current directory is important because a group may also create or modify virtual files. Restoring the complete earlier workspace would discard those intended changes. The finally block restores navigation even when evaluation exits through an exception. Nested groups apply the same rule independently, and a fallback after a failed group therefore starts in the caller’s directory.</w:t>
+      </w:r>
+    </w:p>
+    <w:p>
+      <w:pPr>
         <w:pStyle w:val="ReportTopic"/>
+        <w:keepLines/>
         <w:pageBreakBefore/>
       </w:pPr>
+      <w:bookmarkStart w:id="28" w:name="cmdprelude_topic_28"/>
       <w:r>
         <w:lastRenderedPageBreak/>
         <w:t>Possible future work</w:t>
       </w:r>
+      <w:bookmarkEnd w:id="28"/>
     </w:p>
     <w:p>
       <w:pPr>
         <w:pStyle w:val="ReportSubtopic"/>
+        <w:keepLines/>
       </w:pPr>
       <w:r>
         <w:t>More helpful error explanations</w:t>
@@ -3385,12 +4717,13 @@
         <w:keepLines/>
       </w:pPr>
       <w:r>
-        <w:t>The application could highlight the smallest failing part of a command and explain which grammar rule was expected. Recovery could consider a wider range of edits and rank them by how much they change the input. Any proposed correction should still be shown to the user before use.</w:t>
+        <w:t>The interface could highlight the smallest failing command segment and explain the expected rule. Recovery could rank a wider range of candidate edits, while continuing to show each suggestion for user selection.</w:t>
       </w:r>
     </w:p>
     <w:p>
       <w:pPr>
         <w:pStyle w:val="ReportSubtopic"/>
+        <w:keepLines/>
       </w:pPr>
       <w:r>
         <w:t>Broader command support</w:t>
@@ -3401,12 +4734,13 @@
         <w:keepLines/>
       </w:pPr>
       <w:r>
-        <w:t>More commands and options could be added with explicit grammar and interpreter rules. Redirection, environment variables and wildcard expansion would need careful modelling because their results depend on the environment. Support should be added with test cases and clear limits.</w:t>
+        <w:t>Additional commands and flags could use explicit grammar and interpreter rules. Variables, redirection and wildcards would need careful modelling, documented limits and tests because their effects depend on the environment.</w:t>
       </w:r>
     </w:p>
     <w:p>
       <w:pPr>
         <w:pStyle w:val="ReportSubtopic"/>
+        <w:keepLines/>
       </w:pPr>
       <w:r>
         <w:t>Recovery for real file changes</w:t>
@@ -3417,12 +4751,13 @@
         <w:keepLines/>
       </w:pPr>
       <w:r>
-        <w:t>An optional backup and restore feature could help users recover after an applied operation. A saved operation history could record which paths changed. This would require additional design because the current application applies changes directly and has no automatic rollback.</w:t>
+        <w:t>An optional backup and restore feature could record changed paths and help recover after an applied operation. This needs additional design because the current application applies changes directly without automatic rollback.</w:t>
       </w:r>
     </w:p>
     <w:p>
       <w:pPr>
         <w:pStyle w:val="ReportSubtopic"/>
+        <w:keepLines/>
       </w:pPr>
       <w:r>
         <w:t>Improved learning and comparison tools</w:t>
@@ -3433,12 +4768,13 @@
         <w:keepLines/>
       </w:pPr>
       <w:r>
-        <w:t>A guided mode could explain each transformation using the command the student entered. Side-by-side comparison of two grammars could show why the same input is accepted by one and rejected by the other. A future study could compare how students understand commands before and after using these views.</w:t>
+        <w:t>A guided mode could explain transformations using the entered command. Comparing two grammars could show why they accept different inputs. A classroom study could evaluate whether these explanations improve understanding.</w:t>
       </w:r>
     </w:p>
     <w:p>
       <w:pPr>
         <w:pStyle w:val="ReportSubtopic"/>
+        <w:keepLines/>
       </w:pPr>
       <w:r>
         <w:t>Persistent workspaces and reports</w:t>
@@ -3449,82 +4785,70 @@
         <w:keepLines/>
       </w:pPr>
       <w:r>
-        <w:t>Users could save virtual workspaces, grammar presets and previous analyses. Exporting a command report with its parse tree, errors and proposed file changes would make demonstrations and classroom assessment easier.</w:t>
-      </w:r>
-    </w:p>
-    <w:p>
-      <w:pPr>
-        <w:keepLines/>
-      </w:pPr>
-      <w:r>
-        <w:t>A future evaluation could use a fixed set of commands with known outcomes and ask students to predict the effects before and after using the application. Accuracy and time taken could then be compared. Such a study would help us measure whether the visual explanations improve student understanding and which parts of the interface need more work.</w:t>
+        <w:t>Persistent workspaces, grammar presets and analysis history could support repeated experiments. Exported reports could include the parse tree, errors and proposed changes for demonstrations and assessment.</w:t>
+      </w:r>
+    </w:p>
+    <w:p>
+      <w:pPr>
+        <w:keepLines/>
+      </w:pPr>
+      <w:r>
+        <w:t>A future evaluation could ask students to predict outcomes for a fixed command set before and after using the application. Comparing accuracy and completion time would help identify useful explanations and areas for improvement.</w:t>
       </w:r>
     </w:p>
     <w:p>
       <w:pPr>
         <w:pStyle w:val="ReportTopic"/>
+        <w:keepLines/>
+      </w:pPr>
+      <w:bookmarkStart w:id="29" w:name="cmdprelude_topic_29"/>
+      <w:r>
+        <w:t>Conclusion</w:t>
+      </w:r>
+      <w:bookmarkEnd w:id="29"/>
+    </w:p>
+    <w:p>
+      <w:pPr>
+        <w:keepNext/>
+        <w:keepLines/>
+      </w:pPr>
+      <w:r>
+        <w:t>CmdPrelude connects Theory of Computation with understanding a command before changing files. A CFG defines supported structures, grammar transformations prepare the rules for CYK, and the resulting tree records grouping. Recursive command groups make this connection especially clear.</w:t>
+      </w:r>
+    </w:p>
+    <w:p>
+      <w:pPr>
+        <w:keepNext/>
+        <w:keepLines/>
+      </w:pPr>
+      <w:r>
+        <w:t>A separate interpreter calculates output, errors and proposed file changes on a workspace copy. The interface displays these results alongside file trees and grammar views. Syntax corrections are checked through the same parser, keeping recovery consistent with the selected language.</w:t>
+      </w:r>
+    </w:p>
+    <w:p>
+      <w:pPr>
+        <w:keepLines/>
+      </w:pPr>
+      <w:r>
+        <w:t>The project demonstrates why tokenisation, parsing and interpretation have separate responsibilities. It remains a bounded learning and preview tool rather than a complete shell: valid syntax does not guarantee successful or safe real-world execution. Its contribution is making both the formal reasoning and the expected effects easier to inspect before the user decides what to apply.</w:t>
+      </w:r>
+    </w:p>
+    <w:p>
+      <w:pPr>
+        <w:pStyle w:val="ReportTopic"/>
+        <w:keepLines/>
         <w:pageBreakBefore/>
       </w:pPr>
-      <w:r>
-        <w:lastRenderedPageBreak/>
-        <w:t>Conclusion</w:t>
-      </w:r>
-    </w:p>
-    <w:p>
-      <w:pPr>
-        <w:keepLines/>
-      </w:pPr>
-      <w:r>
-        <w:t>CmdPrelude connects Theory of Computation with a task that users can recognise: understanding a shell command before changing files. The project uses a context-free grammar to describe supported command structures, converts that grammar to CNF and applies CYK parsing to check the input. Nested groups make the connection to recursive language structure visible.</w:t>
-      </w:r>
-    </w:p>
-    <w:p>
-      <w:pPr>
-        <w:keepLines/>
-      </w:pPr>
-      <w:r>
-        <w:t>A separate interpreter uses the resulting tree to calculate command behaviour on a workspace. The interface then explains the result through file trees, output, errors and grammar views. Small syntax corrections are checked through the same parser, so recovery remains connected to the formal language.</w:t>
-      </w:r>
-    </w:p>
-    <w:p>
-      <w:pPr>
-        <w:keepLines/>
-      </w:pPr>
-      <w:r>
-        <w:t>The application is useful as a learning and preview tool within its documented limits. It is not a complete shell, and a successful parse is not a guarantee that a real operation is safe. Its main contribution is making syntax, interpretation and file effects easier to inspect in one place.</w:t>
-      </w:r>
-    </w:p>
-    <w:p>
-      <w:pPr>
-        <w:keepLines/>
-      </w:pPr>
-      <w:r>
-        <w:t>The work also shows why the stages of a language-processing system should remain separate. Tokenisation recognises the input pieces, parsing checks how those pieces fit together, and interpretation determines their effect in a particular workspace. Keeping these responsibilities visible makes errors easier to explain and the implementation easier to extend.</w:t>
-      </w:r>
-    </w:p>
-    <w:p>
-      <w:pPr>
-        <w:keepLines/>
-      </w:pPr>
-      <w:r>
-        <w:t>Overall, the project provides a practical demonstration of grammar-based recognition, tree construction and limited syntax recovery. Its value is in helping the user inspect the reasoning and the consequences before deciding what to do next.</w:t>
-      </w:r>
-    </w:p>
-    <w:p>
-      <w:pPr>
-        <w:pStyle w:val="ReportTopic"/>
-        <w:pageBreakBefore/>
-        <w:spacing w:after="100"/>
-      </w:pPr>
+      <w:bookmarkStart w:id="30" w:name="cmdprelude_topic_30"/>
       <w:r>
         <w:lastRenderedPageBreak/>
         <w:t>References</w:t>
       </w:r>
-    </w:p>
-    <w:p>
-      <w:pPr>
-        <w:keepLines/>
-        <w:spacing w:after="100" w:line="240" w:lineRule="auto"/>
+      <w:bookmarkEnd w:id="30"/>
+    </w:p>
+    <w:p>
+      <w:pPr>
+        <w:keepLines/>
       </w:pPr>
       <w:r>
         <w:t>The following papers provide the theoretical background. The official documentation links describe shell behaviour and the software APIs used in the implementation. Base papers and base links are highlighted below.</w:t>
@@ -3533,7 +4857,7 @@
     <w:p>
       <w:pPr>
         <w:pStyle w:val="ReportSubtopic"/>
-        <w:spacing w:after="100"/>
+        <w:keepLines/>
       </w:pPr>
       <w:r>
         <w:rPr>
@@ -3545,7 +4869,6 @@
     <w:p>
       <w:pPr>
         <w:keepLines/>
-        <w:spacing w:after="100" w:line="240" w:lineRule="auto"/>
       </w:pPr>
       <w:r>
         <w:t>[1] D. H. Younger, "Recognition and parsing of context-free languages in time n³," Information and Control, vol. 10, no. 2, pp. 189-208, 1967. DOI: 10.1016/S0019-9958(67)80007-X.</w:t>
@@ -3553,9 +4876,7 @@
     </w:p>
     <w:p>
       <w:pPr>
-        <w:keepNext/>
-        <w:keepLines/>
-        <w:spacing w:after="100" w:line="240" w:lineRule="auto"/>
+        <w:keepLines/>
       </w:pPr>
       <w:r>
         <w:t>Relevance: theoretical background for the CYK-style recognition stage used by the project.</w:t>
@@ -3564,9 +4885,8 @@
     <w:p>
       <w:pPr>
         <w:keepLines/>
-        <w:spacing w:after="100" w:line="240" w:lineRule="auto"/>
-      </w:pPr>
-      <w:hyperlink r:id="rId13">
+      </w:pPr>
+      <w:hyperlink r:id="rId14">
         <w:r>
           <w:rPr>
             <w:szCs w:val="26"/>
@@ -3579,7 +4899,7 @@
     <w:p>
       <w:pPr>
         <w:pStyle w:val="ReportSubtopic"/>
-        <w:spacing w:after="100"/>
+        <w:keepLines/>
       </w:pPr>
       <w:r>
         <w:rPr>
@@ -3591,7 +4911,6 @@
     <w:p>
       <w:pPr>
         <w:keepLines/>
-        <w:spacing w:after="100" w:line="240" w:lineRule="auto"/>
       </w:pPr>
       <w:r>
         <w:t>[2] A. V. Aho and T. G. Peterson, "A Minimum Distance Error-Correcting Parser for Context-Free Languages," SIAM Journal on Computing, vol. 1, no. 4, pp. 305-312, 1972. DOI: 10.1137/0201022.</w:t>
@@ -3599,9 +4918,7 @@
     </w:p>
     <w:p>
       <w:pPr>
-        <w:keepNext/>
-        <w:keepLines/>
-        <w:spacing w:after="100" w:line="240" w:lineRule="auto"/>
+        <w:keepLines/>
       </w:pPr>
       <w:r>
         <w:t>Relevance: related work on syntax correction. CmdPrelude uses a smaller candidate-and-reparse approach and does not implement this paper's complete algorithm.</w:t>
@@ -3610,9 +4927,8 @@
     <w:p>
       <w:pPr>
         <w:keepLines/>
-        <w:spacing w:after="100" w:line="240" w:lineRule="auto"/>
-      </w:pPr>
-      <w:hyperlink r:id="rId14">
+      </w:pPr>
+      <w:hyperlink r:id="rId15">
         <w:r>
           <w:rPr>
             <w:szCs w:val="26"/>
@@ -3625,7 +4941,7 @@
     <w:p>
       <w:pPr>
         <w:pStyle w:val="ReportSubtopic"/>
-        <w:spacing w:after="100"/>
+        <w:keepLines/>
       </w:pPr>
       <w:r>
         <w:rPr>
@@ -3636,9 +4952,7 @@
     </w:p>
     <w:p>
       <w:pPr>
-        <w:keepNext/>
-        <w:keepLines/>
-        <w:spacing w:after="100" w:line="240" w:lineRule="auto"/>
+        <w:keepLines/>
       </w:pPr>
       <w:r>
         <w:t>[3] GNU Bash Reference Manual, "Lists." Reference for &amp;&amp; and || command chains.</w:t>
@@ -3647,9 +4961,8 @@
     <w:p>
       <w:pPr>
         <w:keepLines/>
-        <w:spacing w:after="100" w:line="240" w:lineRule="auto"/>
-      </w:pPr>
-      <w:hyperlink r:id="rId15">
+      </w:pPr>
+      <w:hyperlink r:id="rId16">
         <w:r>
           <w:rPr>
             <w:szCs w:val="26"/>
@@ -3661,9 +4974,7 @@
     </w:p>
     <w:p>
       <w:pPr>
-        <w:keepNext/>
-        <w:keepLines/>
-        <w:spacing w:after="100" w:line="240" w:lineRule="auto"/>
+        <w:keepLines/>
       </w:pPr>
       <w:r>
         <w:t>[4] GNU Bash Reference Manual, "Pipelines." Reference for pipe behaviour and pipeline exit status.</w:t>
@@ -3672,9 +4983,8 @@
     <w:p>
       <w:pPr>
         <w:keepLines/>
-        <w:spacing w:after="100" w:line="240" w:lineRule="auto"/>
-      </w:pPr>
-      <w:hyperlink r:id="rId16">
+      </w:pPr>
+      <w:hyperlink r:id="rId17">
         <w:r>
           <w:rPr>
             <w:szCs w:val="26"/>
@@ -3686,9 +4996,7 @@
     </w:p>
     <w:p>
       <w:pPr>
-        <w:keepNext/>
-        <w:keepLines/>
-        <w:spacing w:after="100" w:line="240" w:lineRule="auto"/>
+        <w:keepLines/>
       </w:pPr>
       <w:r>
         <w:t>[5] GNU Bash Reference Manual, "Grouping Commands." Reference for parenthesised groups and subshell behaviour.</w:t>
@@ -3697,9 +5005,8 @@
     <w:p>
       <w:pPr>
         <w:keepLines/>
-        <w:spacing w:after="100" w:line="240" w:lineRule="auto"/>
-      </w:pPr>
-      <w:hyperlink r:id="rId17">
+      </w:pPr>
+      <w:hyperlink r:id="rId18">
         <w:r>
           <w:rPr>
             <w:szCs w:val="26"/>
@@ -3712,7 +5019,7 @@
     <w:p>
       <w:pPr>
         <w:pStyle w:val="ReportSubtopic"/>
-        <w:spacing w:after="100"/>
+        <w:keepLines/>
       </w:pPr>
       <w:r>
         <w:t>Software documentation</w:t>
@@ -3720,9 +5027,7 @@
     </w:p>
     <w:p>
       <w:pPr>
-        <w:keepNext/>
-        <w:keepLines/>
-        <w:spacing w:after="100" w:line="240" w:lineRule="auto"/>
+        <w:keepLines/>
       </w:pPr>
       <w:r>
         <w:t>[6] Node.js Documentation, "File system." Reference for the local-folder adapter.</w:t>
@@ -3731,9 +5036,8 @@
     <w:p>
       <w:pPr>
         <w:keepLines/>
-        <w:spacing w:after="100" w:line="240" w:lineRule="auto"/>
-      </w:pPr>
-      <w:hyperlink r:id="rId18">
+      </w:pPr>
+      <w:hyperlink r:id="rId19">
         <w:r>
           <w:rPr>
             <w:szCs w:val="26"/>
@@ -3745,9 +5049,7 @@
     </w:p>
     <w:p>
       <w:pPr>
-        <w:keepNext/>
-        <w:keepLines/>
-        <w:spacing w:after="100" w:line="240" w:lineRule="auto"/>
+        <w:keepLines/>
       </w:pPr>
       <w:r>
         <w:t>[7] Express Documentation, "4.x API Reference." Reference for HTTP routes and middleware.</w:t>
@@ -3756,9 +5058,8 @@
     <w:p>
       <w:pPr>
         <w:keepLines/>
-        <w:spacing w:after="100" w:line="240" w:lineRule="auto"/>
-      </w:pPr>
-      <w:hyperlink r:id="rId19">
+      </w:pPr>
+      <w:hyperlink r:id="rId20">
         <w:r>
           <w:rPr>
             <w:szCs w:val="26"/>
@@ -3769,10 +5070,10 @@
       </w:hyperlink>
     </w:p>
     <w:sectPr>
-      <w:footerReference w:type="default" r:id="rId20"/>
+      <w:footerReference w:type="default" r:id="rId21"/>
       <w:pgSz w:w="11909" w:h="16834"/>
-      <w:pgMar w:top="1080" w:right="1224" w:bottom="1008" w:left="1224" w:header="720" w:footer="432" w:gutter="0"/>
-      <w:pgNumType w:start="0"/>
+      <w:pgMar w:top="979" w:right="1080" w:bottom="936" w:left="1080" w:header="720" w:footer="403" w:gutter="0"/>
+      <w:pgNumType w:start="1"/>
       <w:cols w:space="720"/>
       <w:titlePg/>
       <w:docGrid w:linePitch="360"/>
@@ -3786,7 +5087,7 @@
   <w:endnote w:type="separator" w:id="-1">
     <w:p>
       <w:pPr>
-        <w:spacing w:after="0" w:line="240" w:lineRule="auto"/>
+        <w:spacing w:after="0"/>
       </w:pPr>
       <w:r>
         <w:separator/>
@@ -3796,7 +5097,7 @@
   <w:endnote w:type="continuationSeparator" w:id="0">
     <w:p>
       <w:pPr>
-        <w:spacing w:after="0" w:line="240" w:lineRule="auto"/>
+        <w:spacing w:after="0"/>
       </w:pPr>
       <w:r>
         <w:continuationSeparator/>
@@ -3840,7 +5141,7 @@
   <w:footnote w:type="separator" w:id="-1">
     <w:p>
       <w:pPr>
-        <w:spacing w:after="0" w:line="240" w:lineRule="auto"/>
+        <w:spacing w:after="0"/>
       </w:pPr>
       <w:r>
         <w:separator/>
@@ -3850,7 +5151,7 @@
   <w:footnote w:type="continuationSeparator" w:id="0">
     <w:p>
       <w:pPr>
-        <w:spacing w:after="0" w:line="240" w:lineRule="auto"/>
+        <w:spacing w:after="0"/>
       </w:pPr>
       <w:r>
         <w:continuationSeparator/>
@@ -4570,7 +5871,7 @@
     <w:qFormat/>
     <w:rsid w:val="00FC693F"/>
     <w:pPr>
-      <w:spacing w:after="140"/>
+      <w:spacing w:after="80" w:line="240" w:lineRule="auto"/>
     </w:pPr>
     <w:rPr>
       <w:rFonts w:ascii="Times New Roman" w:eastAsia="Times New Roman" w:hAnsi="Times New Roman"/>
@@ -4814,7 +6115,7 @@
         <w:tab w:val="center" w:pos="4680"/>
         <w:tab w:val="right" w:pos="9360"/>
       </w:tabs>
-      <w:spacing w:after="0" w:line="240" w:lineRule="auto"/>
+      <w:spacing w:after="0"/>
     </w:pPr>
   </w:style>
   <w:style w:type="character" w:customStyle="1" w:styleId="HeaderChar">
@@ -4836,7 +6137,7 @@
         <w:tab w:val="center" w:pos="4680"/>
         <w:tab w:val="right" w:pos="9360"/>
       </w:tabs>
-      <w:spacing w:after="0" w:line="240" w:lineRule="auto"/>
+      <w:spacing w:after="0"/>
     </w:pPr>
   </w:style>
   <w:style w:type="character" w:customStyle="1" w:styleId="FooterChar">
@@ -4905,7 +6206,7 @@
     <w:rsid w:val="00FC693F"/>
     <w:pPr>
       <w:keepNext/>
-      <w:spacing w:before="220" w:line="240" w:lineRule="auto"/>
+      <w:spacing w:before="220"/>
       <w:contextualSpacing/>
     </w:pPr>
     <w:rPr>
@@ -5336,9 +6637,6 @@
     <w:unhideWhenUsed/>
     <w:qFormat/>
     <w:rsid w:val="00FC693F"/>
-    <w:pPr>
-      <w:spacing w:line="240" w:lineRule="auto"/>
-    </w:pPr>
     <w:rPr>
       <w:b/>
       <w:bCs/>
@@ -15491,8 +16789,7 @@
     <w:next w:val="Normal"/>
     <w:pPr>
       <w:keepNext/>
-      <w:keepLines/>
-      <w:spacing w:before="240" w:after="160"/>
+      <w:spacing w:before="180" w:after="100"/>
     </w:pPr>
     <w:rPr>
       <w:b/>
@@ -15506,8 +16803,7 @@
     <w:next w:val="Normal"/>
     <w:pPr>
       <w:keepNext/>
-      <w:keepLines/>
-      <w:spacing w:before="240" w:after="160"/>
+      <w:spacing w:before="140"/>
     </w:pPr>
     <w:rPr>
       <w:b/>

</xml_diff>